<commit_message>
docs: establish API and database contract baseline
</commit_message>
<xml_diff>
--- a/docs/DB-Schema-Tables.docx
+++ b/docs/DB-Schema-Tables.docx
@@ -223,7 +223,7 @@
                 <w:i w:val="0"/>
                 <w:sz w:val="26"/>
               </w:rPr>
-              <w:t>user_id</w:t>
+              <w:t>id</w:t>
             </w:r>
           </w:p>
         </w:tc>
@@ -250,7 +250,7 @@
                 <w:i w:val="0"/>
                 <w:sz w:val="26"/>
               </w:rPr>
-              <w:t>bigint (PK)</w:t>
+              <w:t>uuid (PK)</w:t>
             </w:r>
           </w:p>
         </w:tc>
@@ -883,7 +883,7 @@
                 <w:i w:val="0"/>
                 <w:sz w:val="26"/>
               </w:rPr>
-              <w:t>is_active</w:t>
+              <w:t>notification_prefs</w:t>
             </w:r>
           </w:p>
         </w:tc>
@@ -910,7 +910,7 @@
                 <w:i w:val="0"/>
                 <w:sz w:val="26"/>
               </w:rPr>
-              <w:t>boolean</w:t>
+              <w:t>jsonb</w:t>
             </w:r>
           </w:p>
         </w:tc>
@@ -937,7 +937,7 @@
                 <w:i w:val="0"/>
                 <w:sz w:val="26"/>
               </w:rPr>
-              <w:t>Soft-delete flag</w:t>
+              <w:t>Four email-delivery preference booleans, default true</w:t>
             </w:r>
           </w:p>
         </w:tc>
@@ -993,7 +993,7 @@
                 <w:i w:val="0"/>
                 <w:sz w:val="26"/>
               </w:rPr>
-              <w:t>created_at</w:t>
+              <w:t>is_active</w:t>
             </w:r>
           </w:p>
         </w:tc>
@@ -1020,7 +1020,7 @@
                 <w:i w:val="0"/>
                 <w:sz w:val="26"/>
               </w:rPr>
-              <w:t>timestamptz</w:t>
+              <w:t>boolean</w:t>
             </w:r>
           </w:p>
         </w:tc>
@@ -1047,7 +1047,7 @@
                 <w:i w:val="0"/>
                 <w:sz w:val="26"/>
               </w:rPr>
-              <w:t>Creation time</w:t>
+              <w:t>Soft-delete flag</w:t>
             </w:r>
           </w:p>
         </w:tc>
@@ -1077,6 +1077,116 @@
                 <w:sz w:val="26"/>
               </w:rPr>
               <w:t>9</w:t>
+            </w:r>
+          </w:p>
+        </w:tc>
+        <w:tc>
+          <w:tcPr>
+            <w:tcW w:type="dxa" w:w="2736"/>
+            <w:tcBorders>
+              <w:top w:val="single" w:sz="6" w:color="000000"/>
+              <w:left w:val="single" w:sz="6" w:color="000000"/>
+              <w:bottom w:val="single" w:sz="6" w:color="000000"/>
+              <w:right w:val="single" w:sz="6" w:color="000000"/>
+            </w:tcBorders>
+          </w:tcPr>
+          <w:p>
+            <w:pPr>
+              <w:spacing w:before="60" w:after="60"/>
+              <w:jc w:val="left"/>
+            </w:pPr>
+            <w:r/>
+            <w:r>
+              <w:rPr>
+                <w:rFonts w:ascii="Times New Roman" w:hAnsi="Times New Roman" w:eastAsia="Times New Roman"/>
+                <w:b w:val="0"/>
+                <w:i w:val="0"/>
+                <w:sz w:val="26"/>
+              </w:rPr>
+              <w:t>created_at</w:t>
+            </w:r>
+          </w:p>
+        </w:tc>
+        <w:tc>
+          <w:tcPr>
+            <w:tcW w:type="dxa" w:w="2160"/>
+            <w:tcBorders>
+              <w:top w:val="single" w:sz="6" w:color="000000"/>
+              <w:left w:val="single" w:sz="6" w:color="000000"/>
+              <w:bottom w:val="single" w:sz="6" w:color="000000"/>
+              <w:right w:val="single" w:sz="6" w:color="000000"/>
+            </w:tcBorders>
+          </w:tcPr>
+          <w:p>
+            <w:pPr>
+              <w:spacing w:before="60" w:after="60"/>
+              <w:jc w:val="left"/>
+            </w:pPr>
+            <w:r/>
+            <w:r>
+              <w:rPr>
+                <w:rFonts w:ascii="Times New Roman" w:hAnsi="Times New Roman" w:eastAsia="Times New Roman"/>
+                <w:b w:val="0"/>
+                <w:i w:val="0"/>
+                <w:sz w:val="26"/>
+              </w:rPr>
+              <w:t>timestamptz</w:t>
+            </w:r>
+          </w:p>
+        </w:tc>
+        <w:tc>
+          <w:tcPr>
+            <w:tcW w:type="dxa" w:w="4320"/>
+            <w:tcBorders>
+              <w:top w:val="single" w:sz="6" w:color="000000"/>
+              <w:left w:val="single" w:sz="6" w:color="000000"/>
+              <w:bottom w:val="single" w:sz="6" w:color="000000"/>
+              <w:right w:val="single" w:sz="6" w:color="000000"/>
+            </w:tcBorders>
+          </w:tcPr>
+          <w:p>
+            <w:pPr>
+              <w:spacing w:before="60" w:after="60"/>
+              <w:jc w:val="left"/>
+            </w:pPr>
+            <w:r/>
+            <w:r>
+              <w:rPr>
+                <w:rFonts w:ascii="Times New Roman" w:hAnsi="Times New Roman" w:eastAsia="Times New Roman"/>
+                <w:b w:val="0"/>
+                <w:i w:val="0"/>
+                <w:sz w:val="26"/>
+              </w:rPr>
+              <w:t>Creation time</w:t>
+            </w:r>
+          </w:p>
+        </w:tc>
+      </w:tr>
+      <w:tr>
+        <w:tc>
+          <w:tcPr>
+            <w:tcW w:type="dxa" w:w="864"/>
+            <w:tcBorders>
+              <w:top w:val="single" w:sz="6" w:color="000000"/>
+              <w:left w:val="single" w:sz="6" w:color="000000"/>
+              <w:bottom w:val="single" w:sz="6" w:color="000000"/>
+              <w:right w:val="single" w:sz="6" w:color="000000"/>
+            </w:tcBorders>
+          </w:tcPr>
+          <w:p>
+            <w:pPr>
+              <w:spacing w:before="60" w:after="60"/>
+              <w:jc w:val="center"/>
+            </w:pPr>
+            <w:r/>
+            <w:r>
+              <w:rPr>
+                <w:rFonts w:ascii="Times New Roman" w:hAnsi="Times New Roman" w:eastAsia="Times New Roman"/>
+                <w:b w:val="0"/>
+                <w:i w:val="0"/>
+                <w:sz w:val="26"/>
+              </w:rPr>
+              <w:t>10</w:t>
             </w:r>
           </w:p>
         </w:tc>
@@ -1397,7 +1507,7 @@
                 <w:i w:val="0"/>
                 <w:sz w:val="26"/>
               </w:rPr>
-              <w:t>bigint (PK, FK)</w:t>
+              <w:t>uuid (PK, FK)</w:t>
             </w:r>
           </w:p>
         </w:tc>
@@ -1424,7 +1534,7 @@
                 <w:i w:val="0"/>
                 <w:sz w:val="26"/>
               </w:rPr>
-              <w:t>Foreign key referencing users(user_id); must be a LECTURER</w:t>
+              <w:t>Foreign key referencing users(id); must be a LECTURER</w:t>
             </w:r>
           </w:p>
         </w:tc>
@@ -2077,7 +2187,7 @@
                 <w:i w:val="0"/>
                 <w:sz w:val="26"/>
               </w:rPr>
-              <w:t>token_id</w:t>
+              <w:t>id</w:t>
             </w:r>
           </w:p>
         </w:tc>
@@ -2104,7 +2214,7 @@
                 <w:i w:val="0"/>
                 <w:sz w:val="26"/>
               </w:rPr>
-              <w:t>bigint (PK)</w:t>
+              <w:t>uuid (PK)</w:t>
             </w:r>
           </w:p>
         </w:tc>
@@ -2214,7 +2324,7 @@
                 <w:i w:val="0"/>
                 <w:sz w:val="26"/>
               </w:rPr>
-              <w:t>bigint (FK)</w:t>
+              <w:t>uuid (FK)</w:t>
             </w:r>
           </w:p>
         </w:tc>
@@ -2241,7 +2351,7 @@
                 <w:i w:val="0"/>
                 <w:sz w:val="26"/>
               </w:rPr>
-              <w:t>Foreign key referencing users(user_id)</w:t>
+              <w:t>Foreign key referencing users(id)</w:t>
             </w:r>
           </w:p>
         </w:tc>
@@ -2572,6 +2682,823 @@
                 <w:sz w:val="26"/>
               </w:rPr>
               <w:t>Set when redeemed; NULL means still usable</w:t>
+            </w:r>
+          </w:p>
+        </w:tc>
+      </w:tr>
+      <w:tr>
+        <w:tc>
+          <w:tcPr>
+            <w:tcW w:type="dxa" w:w="864"/>
+            <w:tcBorders>
+              <w:top w:val="single" w:sz="6" w:color="000000"/>
+              <w:left w:val="single" w:sz="6" w:color="000000"/>
+              <w:bottom w:val="single" w:sz="6" w:color="000000"/>
+              <w:right w:val="single" w:sz="6" w:color="000000"/>
+            </w:tcBorders>
+          </w:tcPr>
+          <w:p>
+            <w:pPr>
+              <w:spacing w:before="60" w:after="60"/>
+              <w:jc w:val="center"/>
+            </w:pPr>
+            <w:r/>
+            <w:r>
+              <w:rPr>
+                <w:rFonts w:ascii="Times New Roman" w:hAnsi="Times New Roman" w:eastAsia="Times New Roman"/>
+                <w:b w:val="0"/>
+                <w:i w:val="0"/>
+                <w:sz w:val="26"/>
+              </w:rPr>
+              <w:t>6</w:t>
+            </w:r>
+          </w:p>
+        </w:tc>
+        <w:tc>
+          <w:tcPr>
+            <w:tcW w:type="dxa" w:w="2736"/>
+            <w:tcBorders>
+              <w:top w:val="single" w:sz="6" w:color="000000"/>
+              <w:left w:val="single" w:sz="6" w:color="000000"/>
+              <w:bottom w:val="single" w:sz="6" w:color="000000"/>
+              <w:right w:val="single" w:sz="6" w:color="000000"/>
+            </w:tcBorders>
+          </w:tcPr>
+          <w:p>
+            <w:pPr>
+              <w:spacing w:before="60" w:after="60"/>
+              <w:jc w:val="left"/>
+            </w:pPr>
+            <w:r/>
+            <w:r>
+              <w:rPr>
+                <w:rFonts w:ascii="Times New Roman" w:hAnsi="Times New Roman" w:eastAsia="Times New Roman"/>
+                <w:b w:val="0"/>
+                <w:i w:val="0"/>
+                <w:sz w:val="26"/>
+              </w:rPr>
+              <w:t>created_at</w:t>
+            </w:r>
+          </w:p>
+        </w:tc>
+        <w:tc>
+          <w:tcPr>
+            <w:tcW w:type="dxa" w:w="2160"/>
+            <w:tcBorders>
+              <w:top w:val="single" w:sz="6" w:color="000000"/>
+              <w:left w:val="single" w:sz="6" w:color="000000"/>
+              <w:bottom w:val="single" w:sz="6" w:color="000000"/>
+              <w:right w:val="single" w:sz="6" w:color="000000"/>
+            </w:tcBorders>
+          </w:tcPr>
+          <w:p>
+            <w:pPr>
+              <w:spacing w:before="60" w:after="60"/>
+              <w:jc w:val="left"/>
+            </w:pPr>
+            <w:r/>
+            <w:r>
+              <w:rPr>
+                <w:rFonts w:ascii="Times New Roman" w:hAnsi="Times New Roman" w:eastAsia="Times New Roman"/>
+                <w:b w:val="0"/>
+                <w:i w:val="0"/>
+                <w:sz w:val="26"/>
+              </w:rPr>
+              <w:t>timestamptz</w:t>
+            </w:r>
+          </w:p>
+        </w:tc>
+        <w:tc>
+          <w:tcPr>
+            <w:tcW w:type="dxa" w:w="4320"/>
+            <w:tcBorders>
+              <w:top w:val="single" w:sz="6" w:color="000000"/>
+              <w:left w:val="single" w:sz="6" w:color="000000"/>
+              <w:bottom w:val="single" w:sz="6" w:color="000000"/>
+              <w:right w:val="single" w:sz="6" w:color="000000"/>
+            </w:tcBorders>
+          </w:tcPr>
+          <w:p>
+            <w:pPr>
+              <w:spacing w:before="60" w:after="60"/>
+              <w:jc w:val="left"/>
+            </w:pPr>
+            <w:r/>
+            <w:r>
+              <w:rPr>
+                <w:rFonts w:ascii="Times New Roman" w:hAnsi="Times New Roman" w:eastAsia="Times New Roman"/>
+                <w:b w:val="0"/>
+                <w:i w:val="0"/>
+                <w:sz w:val="26"/>
+              </w:rPr>
+              <w:t>Creation time</w:t>
+            </w:r>
+          </w:p>
+        </w:tc>
+      </w:tr>
+    </w:tbl>
+    <w:p>
+      <w:pPr>
+        <w:keepNext/>
+        <w:spacing w:before="280"/>
+      </w:pPr>
+      <w:r>
+        <w:rPr>
+          <w:rFonts w:ascii="Times New Roman" w:hAnsi="Times New Roman" w:eastAsia="Times New Roman"/>
+          <w:b w:val="0"/>
+          <w:i w:val="0"/>
+          <w:sz w:val="26"/>
+        </w:rPr>
+        <w:t>Refresh Tokens Table: Server-side refresh-token sessions, rotated on every refresh and revoked on logout or password change.</w:t>
+      </w:r>
+    </w:p>
+    <w:p>
+      <w:pPr>
+        <w:keepNext/>
+        <w:jc w:val="center"/>
+      </w:pPr>
+      <w:r>
+        <w:rPr>
+          <w:rFonts w:ascii="Times New Roman" w:hAnsi="Times New Roman" w:eastAsia="Times New Roman"/>
+          <w:b w:val="0"/>
+          <w:i/>
+          <w:sz w:val="26"/>
+        </w:rPr>
+        <w:t>Table 4. Refresh Tokens Table</w:t>
+      </w:r>
+    </w:p>
+    <w:tbl>
+      <w:tblPr>
+        <w:tblW w:type="auto" w:w="0"/>
+        <w:jc w:val="center"/>
+        <w:tblLayout w:type="fixed"/>
+        <w:tblLook w:firstColumn="1" w:firstRow="1" w:lastColumn="0" w:lastRow="0" w:noHBand="0" w:noVBand="1" w:val="04A0"/>
+      </w:tblPr>
+      <w:tblGrid>
+        <w:gridCol w:w="2340"/>
+        <w:gridCol w:w="2340"/>
+        <w:gridCol w:w="2340"/>
+        <w:gridCol w:w="2340"/>
+      </w:tblGrid>
+      <w:tr>
+        <w:trPr>
+          <w:tblHeader w:val="true"/>
+        </w:trPr>
+        <w:tc>
+          <w:tcPr>
+            <w:tcW w:type="dxa" w:w="864"/>
+            <w:tcBorders>
+              <w:top w:val="single" w:sz="6" w:color="000000"/>
+              <w:left w:val="single" w:sz="6" w:color="000000"/>
+              <w:bottom w:val="single" w:sz="6" w:color="000000"/>
+              <w:right w:val="single" w:sz="6" w:color="000000"/>
+            </w:tcBorders>
+          </w:tcPr>
+          <w:p>
+            <w:pPr>
+              <w:spacing w:before="60" w:after="60"/>
+              <w:jc w:val="center"/>
+            </w:pPr>
+            <w:r/>
+            <w:r>
+              <w:rPr>
+                <w:rFonts w:ascii="Times New Roman" w:hAnsi="Times New Roman" w:eastAsia="Times New Roman"/>
+                <w:b/>
+                <w:i w:val="0"/>
+                <w:sz w:val="26"/>
+              </w:rPr>
+              <w:t>No.</w:t>
+            </w:r>
+          </w:p>
+        </w:tc>
+        <w:tc>
+          <w:tcPr>
+            <w:tcW w:type="dxa" w:w="2736"/>
+            <w:tcBorders>
+              <w:top w:val="single" w:sz="6" w:color="000000"/>
+              <w:left w:val="single" w:sz="6" w:color="000000"/>
+              <w:bottom w:val="single" w:sz="6" w:color="000000"/>
+              <w:right w:val="single" w:sz="6" w:color="000000"/>
+            </w:tcBorders>
+          </w:tcPr>
+          <w:p>
+            <w:pPr>
+              <w:spacing w:before="60" w:after="60"/>
+              <w:jc w:val="center"/>
+            </w:pPr>
+            <w:r/>
+            <w:r>
+              <w:rPr>
+                <w:rFonts w:ascii="Times New Roman" w:hAnsi="Times New Roman" w:eastAsia="Times New Roman"/>
+                <w:b/>
+                <w:i w:val="0"/>
+                <w:sz w:val="26"/>
+              </w:rPr>
+              <w:t>Field Name</w:t>
+            </w:r>
+          </w:p>
+        </w:tc>
+        <w:tc>
+          <w:tcPr>
+            <w:tcW w:type="dxa" w:w="2160"/>
+            <w:tcBorders>
+              <w:top w:val="single" w:sz="6" w:color="000000"/>
+              <w:left w:val="single" w:sz="6" w:color="000000"/>
+              <w:bottom w:val="single" w:sz="6" w:color="000000"/>
+              <w:right w:val="single" w:sz="6" w:color="000000"/>
+            </w:tcBorders>
+          </w:tcPr>
+          <w:p>
+            <w:pPr>
+              <w:spacing w:before="60" w:after="60"/>
+              <w:jc w:val="center"/>
+            </w:pPr>
+            <w:r/>
+            <w:r>
+              <w:rPr>
+                <w:rFonts w:ascii="Times New Roman" w:hAnsi="Times New Roman" w:eastAsia="Times New Roman"/>
+                <w:b/>
+                <w:i w:val="0"/>
+                <w:sz w:val="26"/>
+              </w:rPr>
+              <w:t>Type</w:t>
+            </w:r>
+          </w:p>
+        </w:tc>
+        <w:tc>
+          <w:tcPr>
+            <w:tcW w:type="dxa" w:w="4320"/>
+            <w:tcBorders>
+              <w:top w:val="single" w:sz="6" w:color="000000"/>
+              <w:left w:val="single" w:sz="6" w:color="000000"/>
+              <w:bottom w:val="single" w:sz="6" w:color="000000"/>
+              <w:right w:val="single" w:sz="6" w:color="000000"/>
+            </w:tcBorders>
+          </w:tcPr>
+          <w:p>
+            <w:pPr>
+              <w:spacing w:before="60" w:after="60"/>
+              <w:jc w:val="center"/>
+            </w:pPr>
+            <w:r/>
+            <w:r>
+              <w:rPr>
+                <w:rFonts w:ascii="Times New Roman" w:hAnsi="Times New Roman" w:eastAsia="Times New Roman"/>
+                <w:b/>
+                <w:i w:val="0"/>
+                <w:sz w:val="26"/>
+              </w:rPr>
+              <w:t>Description</w:t>
+            </w:r>
+          </w:p>
+        </w:tc>
+      </w:tr>
+      <w:tr>
+        <w:tc>
+          <w:tcPr>
+            <w:tcW w:type="dxa" w:w="864"/>
+            <w:tcBorders>
+              <w:top w:val="single" w:sz="6" w:color="000000"/>
+              <w:left w:val="single" w:sz="6" w:color="000000"/>
+              <w:bottom w:val="single" w:sz="6" w:color="000000"/>
+              <w:right w:val="single" w:sz="6" w:color="000000"/>
+            </w:tcBorders>
+          </w:tcPr>
+          <w:p>
+            <w:pPr>
+              <w:spacing w:before="60" w:after="60"/>
+              <w:jc w:val="center"/>
+            </w:pPr>
+            <w:r/>
+            <w:r>
+              <w:rPr>
+                <w:rFonts w:ascii="Times New Roman" w:hAnsi="Times New Roman" w:eastAsia="Times New Roman"/>
+                <w:b w:val="0"/>
+                <w:i w:val="0"/>
+                <w:sz w:val="26"/>
+              </w:rPr>
+              <w:t>1</w:t>
+            </w:r>
+          </w:p>
+        </w:tc>
+        <w:tc>
+          <w:tcPr>
+            <w:tcW w:type="dxa" w:w="2736"/>
+            <w:tcBorders>
+              <w:top w:val="single" w:sz="6" w:color="000000"/>
+              <w:left w:val="single" w:sz="6" w:color="000000"/>
+              <w:bottom w:val="single" w:sz="6" w:color="000000"/>
+              <w:right w:val="single" w:sz="6" w:color="000000"/>
+            </w:tcBorders>
+          </w:tcPr>
+          <w:p>
+            <w:pPr>
+              <w:spacing w:before="60" w:after="60"/>
+              <w:jc w:val="left"/>
+            </w:pPr>
+            <w:r/>
+            <w:r>
+              <w:rPr>
+                <w:rFonts w:ascii="Times New Roman" w:hAnsi="Times New Roman" w:eastAsia="Times New Roman"/>
+                <w:b w:val="0"/>
+                <w:i w:val="0"/>
+                <w:sz w:val="26"/>
+              </w:rPr>
+              <w:t>id</w:t>
+            </w:r>
+          </w:p>
+        </w:tc>
+        <w:tc>
+          <w:tcPr>
+            <w:tcW w:type="dxa" w:w="2160"/>
+            <w:tcBorders>
+              <w:top w:val="single" w:sz="6" w:color="000000"/>
+              <w:left w:val="single" w:sz="6" w:color="000000"/>
+              <w:bottom w:val="single" w:sz="6" w:color="000000"/>
+              <w:right w:val="single" w:sz="6" w:color="000000"/>
+            </w:tcBorders>
+          </w:tcPr>
+          <w:p>
+            <w:pPr>
+              <w:spacing w:before="60" w:after="60"/>
+              <w:jc w:val="left"/>
+            </w:pPr>
+            <w:r/>
+            <w:r>
+              <w:rPr>
+                <w:rFonts w:ascii="Times New Roman" w:hAnsi="Times New Roman" w:eastAsia="Times New Roman"/>
+                <w:b w:val="0"/>
+                <w:i w:val="0"/>
+                <w:sz w:val="26"/>
+              </w:rPr>
+              <w:t>uuid (PK)</w:t>
+            </w:r>
+          </w:p>
+        </w:tc>
+        <w:tc>
+          <w:tcPr>
+            <w:tcW w:type="dxa" w:w="4320"/>
+            <w:tcBorders>
+              <w:top w:val="single" w:sz="6" w:color="000000"/>
+              <w:left w:val="single" w:sz="6" w:color="000000"/>
+              <w:bottom w:val="single" w:sz="6" w:color="000000"/>
+              <w:right w:val="single" w:sz="6" w:color="000000"/>
+            </w:tcBorders>
+          </w:tcPr>
+          <w:p>
+            <w:pPr>
+              <w:spacing w:before="60" w:after="60"/>
+              <w:jc w:val="left"/>
+            </w:pPr>
+            <w:r/>
+            <w:r>
+              <w:rPr>
+                <w:rFonts w:ascii="Times New Roman" w:hAnsi="Times New Roman" w:eastAsia="Times New Roman"/>
+                <w:b w:val="0"/>
+                <w:i w:val="0"/>
+                <w:sz w:val="26"/>
+              </w:rPr>
+              <w:t>Unique session identifier</w:t>
+            </w:r>
+          </w:p>
+        </w:tc>
+      </w:tr>
+      <w:tr>
+        <w:tc>
+          <w:tcPr>
+            <w:tcW w:type="dxa" w:w="864"/>
+            <w:tcBorders>
+              <w:top w:val="single" w:sz="6" w:color="000000"/>
+              <w:left w:val="single" w:sz="6" w:color="000000"/>
+              <w:bottom w:val="single" w:sz="6" w:color="000000"/>
+              <w:right w:val="single" w:sz="6" w:color="000000"/>
+            </w:tcBorders>
+          </w:tcPr>
+          <w:p>
+            <w:pPr>
+              <w:spacing w:before="60" w:after="60"/>
+              <w:jc w:val="center"/>
+            </w:pPr>
+            <w:r/>
+            <w:r>
+              <w:rPr>
+                <w:rFonts w:ascii="Times New Roman" w:hAnsi="Times New Roman" w:eastAsia="Times New Roman"/>
+                <w:b w:val="0"/>
+                <w:i w:val="0"/>
+                <w:sz w:val="26"/>
+              </w:rPr>
+              <w:t>2</w:t>
+            </w:r>
+          </w:p>
+        </w:tc>
+        <w:tc>
+          <w:tcPr>
+            <w:tcW w:type="dxa" w:w="2736"/>
+            <w:tcBorders>
+              <w:top w:val="single" w:sz="6" w:color="000000"/>
+              <w:left w:val="single" w:sz="6" w:color="000000"/>
+              <w:bottom w:val="single" w:sz="6" w:color="000000"/>
+              <w:right w:val="single" w:sz="6" w:color="000000"/>
+            </w:tcBorders>
+          </w:tcPr>
+          <w:p>
+            <w:pPr>
+              <w:spacing w:before="60" w:after="60"/>
+              <w:jc w:val="left"/>
+            </w:pPr>
+            <w:r/>
+            <w:r>
+              <w:rPr>
+                <w:rFonts w:ascii="Times New Roman" w:hAnsi="Times New Roman" w:eastAsia="Times New Roman"/>
+                <w:b w:val="0"/>
+                <w:i w:val="0"/>
+                <w:sz w:val="26"/>
+              </w:rPr>
+              <w:t>user_id</w:t>
+            </w:r>
+          </w:p>
+        </w:tc>
+        <w:tc>
+          <w:tcPr>
+            <w:tcW w:type="dxa" w:w="2160"/>
+            <w:tcBorders>
+              <w:top w:val="single" w:sz="6" w:color="000000"/>
+              <w:left w:val="single" w:sz="6" w:color="000000"/>
+              <w:bottom w:val="single" w:sz="6" w:color="000000"/>
+              <w:right w:val="single" w:sz="6" w:color="000000"/>
+            </w:tcBorders>
+          </w:tcPr>
+          <w:p>
+            <w:pPr>
+              <w:spacing w:before="60" w:after="60"/>
+              <w:jc w:val="left"/>
+            </w:pPr>
+            <w:r/>
+            <w:r>
+              <w:rPr>
+                <w:rFonts w:ascii="Times New Roman" w:hAnsi="Times New Roman" w:eastAsia="Times New Roman"/>
+                <w:b w:val="0"/>
+                <w:i w:val="0"/>
+                <w:sz w:val="26"/>
+              </w:rPr>
+              <w:t>uuid (FK)</w:t>
+            </w:r>
+          </w:p>
+        </w:tc>
+        <w:tc>
+          <w:tcPr>
+            <w:tcW w:type="dxa" w:w="4320"/>
+            <w:tcBorders>
+              <w:top w:val="single" w:sz="6" w:color="000000"/>
+              <w:left w:val="single" w:sz="6" w:color="000000"/>
+              <w:bottom w:val="single" w:sz="6" w:color="000000"/>
+              <w:right w:val="single" w:sz="6" w:color="000000"/>
+            </w:tcBorders>
+          </w:tcPr>
+          <w:p>
+            <w:pPr>
+              <w:spacing w:before="60" w:after="60"/>
+              <w:jc w:val="left"/>
+            </w:pPr>
+            <w:r/>
+            <w:r>
+              <w:rPr>
+                <w:rFonts w:ascii="Times New Roman" w:hAnsi="Times New Roman" w:eastAsia="Times New Roman"/>
+                <w:b w:val="0"/>
+                <w:i w:val="0"/>
+                <w:sz w:val="26"/>
+              </w:rPr>
+              <w:t>Foreign key referencing users(id)</w:t>
+            </w:r>
+          </w:p>
+        </w:tc>
+      </w:tr>
+      <w:tr>
+        <w:tc>
+          <w:tcPr>
+            <w:tcW w:type="dxa" w:w="864"/>
+            <w:tcBorders>
+              <w:top w:val="single" w:sz="6" w:color="000000"/>
+              <w:left w:val="single" w:sz="6" w:color="000000"/>
+              <w:bottom w:val="single" w:sz="6" w:color="000000"/>
+              <w:right w:val="single" w:sz="6" w:color="000000"/>
+            </w:tcBorders>
+          </w:tcPr>
+          <w:p>
+            <w:pPr>
+              <w:spacing w:before="60" w:after="60"/>
+              <w:jc w:val="center"/>
+            </w:pPr>
+            <w:r/>
+            <w:r>
+              <w:rPr>
+                <w:rFonts w:ascii="Times New Roman" w:hAnsi="Times New Roman" w:eastAsia="Times New Roman"/>
+                <w:b w:val="0"/>
+                <w:i w:val="0"/>
+                <w:sz w:val="26"/>
+              </w:rPr>
+              <w:t>3</w:t>
+            </w:r>
+          </w:p>
+        </w:tc>
+        <w:tc>
+          <w:tcPr>
+            <w:tcW w:type="dxa" w:w="2736"/>
+            <w:tcBorders>
+              <w:top w:val="single" w:sz="6" w:color="000000"/>
+              <w:left w:val="single" w:sz="6" w:color="000000"/>
+              <w:bottom w:val="single" w:sz="6" w:color="000000"/>
+              <w:right w:val="single" w:sz="6" w:color="000000"/>
+            </w:tcBorders>
+          </w:tcPr>
+          <w:p>
+            <w:pPr>
+              <w:spacing w:before="60" w:after="60"/>
+              <w:jc w:val="left"/>
+            </w:pPr>
+            <w:r/>
+            <w:r>
+              <w:rPr>
+                <w:rFonts w:ascii="Times New Roman" w:hAnsi="Times New Roman" w:eastAsia="Times New Roman"/>
+                <w:b w:val="0"/>
+                <w:i w:val="0"/>
+                <w:sz w:val="26"/>
+              </w:rPr>
+              <w:t>token_hash</w:t>
+            </w:r>
+          </w:p>
+        </w:tc>
+        <w:tc>
+          <w:tcPr>
+            <w:tcW w:type="dxa" w:w="2160"/>
+            <w:tcBorders>
+              <w:top w:val="single" w:sz="6" w:color="000000"/>
+              <w:left w:val="single" w:sz="6" w:color="000000"/>
+              <w:bottom w:val="single" w:sz="6" w:color="000000"/>
+              <w:right w:val="single" w:sz="6" w:color="000000"/>
+            </w:tcBorders>
+          </w:tcPr>
+          <w:p>
+            <w:pPr>
+              <w:spacing w:before="60" w:after="60"/>
+              <w:jc w:val="left"/>
+            </w:pPr>
+            <w:r/>
+            <w:r>
+              <w:rPr>
+                <w:rFonts w:ascii="Times New Roman" w:hAnsi="Times New Roman" w:eastAsia="Times New Roman"/>
+                <w:b w:val="0"/>
+                <w:i w:val="0"/>
+                <w:sz w:val="26"/>
+              </w:rPr>
+              <w:t>text (UK)</w:t>
+            </w:r>
+          </w:p>
+        </w:tc>
+        <w:tc>
+          <w:tcPr>
+            <w:tcW w:type="dxa" w:w="4320"/>
+            <w:tcBorders>
+              <w:top w:val="single" w:sz="6" w:color="000000"/>
+              <w:left w:val="single" w:sz="6" w:color="000000"/>
+              <w:bottom w:val="single" w:sz="6" w:color="000000"/>
+              <w:right w:val="single" w:sz="6" w:color="000000"/>
+            </w:tcBorders>
+          </w:tcPr>
+          <w:p>
+            <w:pPr>
+              <w:spacing w:before="60" w:after="60"/>
+              <w:jc w:val="left"/>
+            </w:pPr>
+            <w:r/>
+            <w:r>
+              <w:rPr>
+                <w:rFonts w:ascii="Times New Roman" w:hAnsi="Times New Roman" w:eastAsia="Times New Roman"/>
+                <w:b w:val="0"/>
+                <w:i w:val="0"/>
+                <w:sz w:val="26"/>
+              </w:rPr>
+              <w:t>SHA-256 of the raw refresh token; the raw value only lives in the httpOnly cookie</w:t>
+            </w:r>
+          </w:p>
+        </w:tc>
+      </w:tr>
+      <w:tr>
+        <w:tc>
+          <w:tcPr>
+            <w:tcW w:type="dxa" w:w="864"/>
+            <w:tcBorders>
+              <w:top w:val="single" w:sz="6" w:color="000000"/>
+              <w:left w:val="single" w:sz="6" w:color="000000"/>
+              <w:bottom w:val="single" w:sz="6" w:color="000000"/>
+              <w:right w:val="single" w:sz="6" w:color="000000"/>
+            </w:tcBorders>
+          </w:tcPr>
+          <w:p>
+            <w:pPr>
+              <w:spacing w:before="60" w:after="60"/>
+              <w:jc w:val="center"/>
+            </w:pPr>
+            <w:r/>
+            <w:r>
+              <w:rPr>
+                <w:rFonts w:ascii="Times New Roman" w:hAnsi="Times New Roman" w:eastAsia="Times New Roman"/>
+                <w:b w:val="0"/>
+                <w:i w:val="0"/>
+                <w:sz w:val="26"/>
+              </w:rPr>
+              <w:t>4</w:t>
+            </w:r>
+          </w:p>
+        </w:tc>
+        <w:tc>
+          <w:tcPr>
+            <w:tcW w:type="dxa" w:w="2736"/>
+            <w:tcBorders>
+              <w:top w:val="single" w:sz="6" w:color="000000"/>
+              <w:left w:val="single" w:sz="6" w:color="000000"/>
+              <w:bottom w:val="single" w:sz="6" w:color="000000"/>
+              <w:right w:val="single" w:sz="6" w:color="000000"/>
+            </w:tcBorders>
+          </w:tcPr>
+          <w:p>
+            <w:pPr>
+              <w:spacing w:before="60" w:after="60"/>
+              <w:jc w:val="left"/>
+            </w:pPr>
+            <w:r/>
+            <w:r>
+              <w:rPr>
+                <w:rFonts w:ascii="Times New Roman" w:hAnsi="Times New Roman" w:eastAsia="Times New Roman"/>
+                <w:b w:val="0"/>
+                <w:i w:val="0"/>
+                <w:sz w:val="26"/>
+              </w:rPr>
+              <w:t>expires_at</w:t>
+            </w:r>
+          </w:p>
+        </w:tc>
+        <w:tc>
+          <w:tcPr>
+            <w:tcW w:type="dxa" w:w="2160"/>
+            <w:tcBorders>
+              <w:top w:val="single" w:sz="6" w:color="000000"/>
+              <w:left w:val="single" w:sz="6" w:color="000000"/>
+              <w:bottom w:val="single" w:sz="6" w:color="000000"/>
+              <w:right w:val="single" w:sz="6" w:color="000000"/>
+            </w:tcBorders>
+          </w:tcPr>
+          <w:p>
+            <w:pPr>
+              <w:spacing w:before="60" w:after="60"/>
+              <w:jc w:val="left"/>
+            </w:pPr>
+            <w:r/>
+            <w:r>
+              <w:rPr>
+                <w:rFonts w:ascii="Times New Roman" w:hAnsi="Times New Roman" w:eastAsia="Times New Roman"/>
+                <w:b w:val="0"/>
+                <w:i w:val="0"/>
+                <w:sz w:val="26"/>
+              </w:rPr>
+              <w:t>timestamptz</w:t>
+            </w:r>
+          </w:p>
+        </w:tc>
+        <w:tc>
+          <w:tcPr>
+            <w:tcW w:type="dxa" w:w="4320"/>
+            <w:tcBorders>
+              <w:top w:val="single" w:sz="6" w:color="000000"/>
+              <w:left w:val="single" w:sz="6" w:color="000000"/>
+              <w:bottom w:val="single" w:sz="6" w:color="000000"/>
+              <w:right w:val="single" w:sz="6" w:color="000000"/>
+            </w:tcBorders>
+          </w:tcPr>
+          <w:p>
+            <w:pPr>
+              <w:spacing w:before="60" w:after="60"/>
+              <w:jc w:val="left"/>
+            </w:pPr>
+            <w:r/>
+            <w:r>
+              <w:rPr>
+                <w:rFonts w:ascii="Times New Roman" w:hAnsi="Times New Roman" w:eastAsia="Times New Roman"/>
+                <w:b w:val="0"/>
+                <w:i w:val="0"/>
+                <w:sz w:val="26"/>
+              </w:rPr>
+              <w:t>Expiry time (creation + 30 days)</w:t>
+            </w:r>
+          </w:p>
+        </w:tc>
+      </w:tr>
+      <w:tr>
+        <w:tc>
+          <w:tcPr>
+            <w:tcW w:type="dxa" w:w="864"/>
+            <w:tcBorders>
+              <w:top w:val="single" w:sz="6" w:color="000000"/>
+              <w:left w:val="single" w:sz="6" w:color="000000"/>
+              <w:bottom w:val="single" w:sz="6" w:color="000000"/>
+              <w:right w:val="single" w:sz="6" w:color="000000"/>
+            </w:tcBorders>
+          </w:tcPr>
+          <w:p>
+            <w:pPr>
+              <w:spacing w:before="60" w:after="60"/>
+              <w:jc w:val="center"/>
+            </w:pPr>
+            <w:r/>
+            <w:r>
+              <w:rPr>
+                <w:rFonts w:ascii="Times New Roman" w:hAnsi="Times New Roman" w:eastAsia="Times New Roman"/>
+                <w:b w:val="0"/>
+                <w:i w:val="0"/>
+                <w:sz w:val="26"/>
+              </w:rPr>
+              <w:t>5</w:t>
+            </w:r>
+          </w:p>
+        </w:tc>
+        <w:tc>
+          <w:tcPr>
+            <w:tcW w:type="dxa" w:w="2736"/>
+            <w:tcBorders>
+              <w:top w:val="single" w:sz="6" w:color="000000"/>
+              <w:left w:val="single" w:sz="6" w:color="000000"/>
+              <w:bottom w:val="single" w:sz="6" w:color="000000"/>
+              <w:right w:val="single" w:sz="6" w:color="000000"/>
+            </w:tcBorders>
+          </w:tcPr>
+          <w:p>
+            <w:pPr>
+              <w:spacing w:before="60" w:after="60"/>
+              <w:jc w:val="left"/>
+            </w:pPr>
+            <w:r/>
+            <w:r>
+              <w:rPr>
+                <w:rFonts w:ascii="Times New Roman" w:hAnsi="Times New Roman" w:eastAsia="Times New Roman"/>
+                <w:b w:val="0"/>
+                <w:i w:val="0"/>
+                <w:sz w:val="26"/>
+              </w:rPr>
+              <w:t>revoked_at</w:t>
+            </w:r>
+          </w:p>
+        </w:tc>
+        <w:tc>
+          <w:tcPr>
+            <w:tcW w:type="dxa" w:w="2160"/>
+            <w:tcBorders>
+              <w:top w:val="single" w:sz="6" w:color="000000"/>
+              <w:left w:val="single" w:sz="6" w:color="000000"/>
+              <w:bottom w:val="single" w:sz="6" w:color="000000"/>
+              <w:right w:val="single" w:sz="6" w:color="000000"/>
+            </w:tcBorders>
+          </w:tcPr>
+          <w:p>
+            <w:pPr>
+              <w:spacing w:before="60" w:after="60"/>
+              <w:jc w:val="left"/>
+            </w:pPr>
+            <w:r/>
+            <w:r>
+              <w:rPr>
+                <w:rFonts w:ascii="Times New Roman" w:hAnsi="Times New Roman" w:eastAsia="Times New Roman"/>
+                <w:b w:val="0"/>
+                <w:i w:val="0"/>
+                <w:sz w:val="26"/>
+              </w:rPr>
+              <w:t>timestamptz</w:t>
+            </w:r>
+          </w:p>
+        </w:tc>
+        <w:tc>
+          <w:tcPr>
+            <w:tcW w:type="dxa" w:w="4320"/>
+            <w:tcBorders>
+              <w:top w:val="single" w:sz="6" w:color="000000"/>
+              <w:left w:val="single" w:sz="6" w:color="000000"/>
+              <w:bottom w:val="single" w:sz="6" w:color="000000"/>
+              <w:right w:val="single" w:sz="6" w:color="000000"/>
+            </w:tcBorders>
+          </w:tcPr>
+          <w:p>
+            <w:pPr>
+              <w:spacing w:before="60" w:after="60"/>
+              <w:jc w:val="left"/>
+            </w:pPr>
+            <w:r/>
+            <w:r>
+              <w:rPr>
+                <w:rFonts w:ascii="Times New Roman" w:hAnsi="Times New Roman" w:eastAsia="Times New Roman"/>
+                <w:b w:val="0"/>
+                <w:i w:val="0"/>
+                <w:sz w:val="26"/>
+              </w:rPr>
+              <w:t>Set on rotation, logout or password change; NULL means active</w:t>
             </w:r>
           </w:p>
         </w:tc>
@@ -2714,7 +3641,7 @@
           <w:i/>
           <w:sz w:val="26"/>
         </w:rPr>
-        <w:t>Table 4. Semesters Table</w:t>
+        <w:t>Table 5. Semesters Table</w:t>
       </w:r>
     </w:p>
     <w:tbl>
@@ -2894,7 +3821,7 @@
                 <w:i w:val="0"/>
                 <w:sz w:val="26"/>
               </w:rPr>
-              <w:t>semester_id</w:t>
+              <w:t>id</w:t>
             </w:r>
           </w:p>
         </w:tc>
@@ -2921,7 +3848,7 @@
                 <w:i w:val="0"/>
                 <w:sz w:val="26"/>
               </w:rPr>
-              <w:t>bigint (PK)</w:t>
+              <w:t>uuid (PK)</w:t>
             </w:r>
           </w:p>
         </w:tc>
@@ -3421,7 +4348,7 @@
           <w:i/>
           <w:sz w:val="26"/>
         </w:rPr>
-        <w:t>Table 5. Availability Rules Table</w:t>
+        <w:t>Table 6. Availability Rules Table</w:t>
       </w:r>
     </w:p>
     <w:tbl>
@@ -3601,7 +4528,7 @@
                 <w:i w:val="0"/>
                 <w:sz w:val="26"/>
               </w:rPr>
-              <w:t>rule_id</w:t>
+              <w:t>id</w:t>
             </w:r>
           </w:p>
         </w:tc>
@@ -3628,7 +4555,7 @@
                 <w:i w:val="0"/>
                 <w:sz w:val="26"/>
               </w:rPr>
-              <w:t>bigint (PK)</w:t>
+              <w:t>uuid (PK)</w:t>
             </w:r>
           </w:p>
         </w:tc>
@@ -3738,7 +4665,7 @@
                 <w:i w:val="0"/>
                 <w:sz w:val="26"/>
               </w:rPr>
-              <w:t>bigint (FK)</w:t>
+              <w:t>uuid (FK)</w:t>
             </w:r>
           </w:p>
         </w:tc>
@@ -3765,7 +4692,7 @@
                 <w:i w:val="0"/>
                 <w:sz w:val="26"/>
               </w:rPr>
-              <w:t>Foreign key referencing users(user_id)</w:t>
+              <w:t>Foreign key referencing users(id)</w:t>
             </w:r>
           </w:p>
         </w:tc>
@@ -3848,7 +4775,7 @@
                 <w:i w:val="0"/>
                 <w:sz w:val="26"/>
               </w:rPr>
-              <w:t>bigint (FK)</w:t>
+              <w:t>uuid (FK)</w:t>
             </w:r>
           </w:p>
         </w:tc>
@@ -3875,7 +4802,7 @@
                 <w:i w:val="0"/>
                 <w:sz w:val="26"/>
               </w:rPr>
-              <w:t>Foreign key referencing semesters(semester_id)</w:t>
+              <w:t>Foreign key referencing semesters(id)</w:t>
             </w:r>
           </w:p>
         </w:tc>
@@ -4535,7 +5462,7 @@
                 <w:i w:val="0"/>
                 <w:sz w:val="26"/>
               </w:rPr>
-              <w:t>Last date the rule applies</w:t>
+              <w:t>NULL means through the semester end date</w:t>
             </w:r>
           </w:p>
         </w:tc>
@@ -4678,7 +5605,7 @@
           <w:i/>
           <w:sz w:val="26"/>
         </w:rPr>
-        <w:t>Table 6. Availability Exceptions Table</w:t>
+        <w:t>Table 7. Availability Exceptions Table</w:t>
       </w:r>
     </w:p>
     <w:tbl>
@@ -4858,7 +5785,7 @@
                 <w:i w:val="0"/>
                 <w:sz w:val="26"/>
               </w:rPr>
-              <w:t>exception_id</w:t>
+              <w:t>id</w:t>
             </w:r>
           </w:p>
         </w:tc>
@@ -4885,7 +5812,7 @@
                 <w:i w:val="0"/>
                 <w:sz w:val="26"/>
               </w:rPr>
-              <w:t>bigint (PK)</w:t>
+              <w:t>uuid (PK)</w:t>
             </w:r>
           </w:p>
         </w:tc>
@@ -4995,7 +5922,7 @@
                 <w:i w:val="0"/>
                 <w:sz w:val="26"/>
               </w:rPr>
-              <w:t>bigint (FK)</w:t>
+              <w:t>uuid (FK)</w:t>
             </w:r>
           </w:p>
         </w:tc>
@@ -5022,7 +5949,7 @@
                 <w:i w:val="0"/>
                 <w:sz w:val="26"/>
               </w:rPr>
-              <w:t>Foreign key referencing users(user_id)</w:t>
+              <w:t>Foreign key referencing users(id)</w:t>
             </w:r>
           </w:p>
         </w:tc>
@@ -5715,7 +6642,7 @@
           <w:i/>
           <w:sz w:val="26"/>
         </w:rPr>
-        <w:t>Table 7. Slots Table</w:t>
+        <w:t>Table 8. Slots Table</w:t>
       </w:r>
     </w:p>
     <w:tbl>
@@ -5895,7 +6822,7 @@
                 <w:i w:val="0"/>
                 <w:sz w:val="26"/>
               </w:rPr>
-              <w:t>slot_id</w:t>
+              <w:t>id</w:t>
             </w:r>
           </w:p>
         </w:tc>
@@ -5922,7 +6849,7 @@
                 <w:i w:val="0"/>
                 <w:sz w:val="26"/>
               </w:rPr>
-              <w:t>bigint (PK)</w:t>
+              <w:t>uuid (PK)</w:t>
             </w:r>
           </w:p>
         </w:tc>
@@ -6032,7 +6959,7 @@
                 <w:i w:val="0"/>
                 <w:sz w:val="26"/>
               </w:rPr>
-              <w:t>bigint (FK)</w:t>
+              <w:t>uuid (FK)</w:t>
             </w:r>
           </w:p>
         </w:tc>
@@ -6059,7 +6986,7 @@
                 <w:i w:val="0"/>
                 <w:sz w:val="26"/>
               </w:rPr>
-              <w:t>Foreign key referencing users(user_id)</w:t>
+              <w:t>Foreign key referencing users(id)</w:t>
             </w:r>
           </w:p>
         </w:tc>
@@ -6142,7 +7069,7 @@
                 <w:i w:val="0"/>
                 <w:sz w:val="26"/>
               </w:rPr>
-              <w:t>bigint (FK)</w:t>
+              <w:t>uuid (FK)</w:t>
             </w:r>
           </w:p>
         </w:tc>
@@ -6169,7 +7096,7 @@
                 <w:i w:val="0"/>
                 <w:sz w:val="26"/>
               </w:rPr>
-              <w:t>Foreign key referencing availability_rules(rule_id); NULL for ad-hoc slots</w:t>
+              <w:t>Foreign key referencing availability_rules(id); NULL for ad-hoc slots</w:t>
             </w:r>
           </w:p>
         </w:tc>
@@ -6642,7 +7569,7 @@
           <w:i/>
           <w:sz w:val="26"/>
         </w:rPr>
-        <w:t>Table 8. Schedule Entries Table</w:t>
+        <w:t>Table 9. Schedule Entries Table</w:t>
       </w:r>
     </w:p>
     <w:tbl>
@@ -6822,7 +7749,7 @@
                 <w:i w:val="0"/>
                 <w:sz w:val="26"/>
               </w:rPr>
-              <w:t>entry_id</w:t>
+              <w:t>id</w:t>
             </w:r>
           </w:p>
         </w:tc>
@@ -6849,7 +7776,7 @@
                 <w:i w:val="0"/>
                 <w:sz w:val="26"/>
               </w:rPr>
-              <w:t>bigint (PK)</w:t>
+              <w:t>uuid (PK)</w:t>
             </w:r>
           </w:p>
         </w:tc>
@@ -6959,7 +7886,7 @@
                 <w:i w:val="0"/>
                 <w:sz w:val="26"/>
               </w:rPr>
-              <w:t>bigint (FK)</w:t>
+              <w:t>uuid (FK)</w:t>
             </w:r>
           </w:p>
         </w:tc>
@@ -6986,7 +7913,7 @@
                 <w:i w:val="0"/>
                 <w:sz w:val="26"/>
               </w:rPr>
-              <w:t>Foreign key referencing users(user_id); owner of the block</w:t>
+              <w:t>Foreign key referencing users(id); owner of the block</w:t>
             </w:r>
           </w:p>
         </w:tc>
@@ -7069,7 +7996,7 @@
                 <w:i w:val="0"/>
                 <w:sz w:val="26"/>
               </w:rPr>
-              <w:t>bigint (FK)</w:t>
+              <w:t>uuid (FK)</w:t>
             </w:r>
           </w:p>
         </w:tc>
@@ -7096,7 +8023,7 @@
                 <w:i w:val="0"/>
                 <w:sz w:val="26"/>
               </w:rPr>
-              <w:t>Foreign key referencing semesters(semester_id)</w:t>
+              <w:t>Foreign key referencing semesters(id)</w:t>
             </w:r>
           </w:p>
         </w:tc>
@@ -8719,7 +9646,7 @@
                 <w:i w:val="0"/>
                 <w:sz w:val="26"/>
               </w:rPr>
-              <w:t>bigint (FK)</w:t>
+              <w:t>uuid (FK)</w:t>
             </w:r>
           </w:p>
         </w:tc>
@@ -8746,7 +9673,7 @@
                 <w:i w:val="0"/>
                 <w:sz w:val="26"/>
               </w:rPr>
-              <w:t>Foreign key referencing schedule_imports(import_id)</w:t>
+              <w:t>Foreign key referencing schedule_imports(id)</w:t>
             </w:r>
           </w:p>
         </w:tc>
@@ -8779,7 +9706,7 @@
           <w:i/>
           <w:sz w:val="26"/>
         </w:rPr>
-        <w:t>Table 9. Schedule Imports Table</w:t>
+        <w:t>Table 10. Schedule Imports Table</w:t>
       </w:r>
     </w:p>
     <w:tbl>
@@ -8959,7 +9886,7 @@
                 <w:i w:val="0"/>
                 <w:sz w:val="26"/>
               </w:rPr>
-              <w:t>import_id</w:t>
+              <w:t>id</w:t>
             </w:r>
           </w:p>
         </w:tc>
@@ -8986,7 +9913,7 @@
                 <w:i w:val="0"/>
                 <w:sz w:val="26"/>
               </w:rPr>
-              <w:t>bigint (PK)</w:t>
+              <w:t>uuid (PK)</w:t>
             </w:r>
           </w:p>
         </w:tc>
@@ -9096,7 +10023,7 @@
                 <w:i w:val="0"/>
                 <w:sz w:val="26"/>
               </w:rPr>
-              <w:t>bigint (FK)</w:t>
+              <w:t>uuid (FK)</w:t>
             </w:r>
           </w:p>
         </w:tc>
@@ -9123,7 +10050,7 @@
                 <w:i w:val="0"/>
                 <w:sz w:val="26"/>
               </w:rPr>
-              <w:t>Foreign key referencing semesters(semester_id)</w:t>
+              <w:t>Foreign key referencing semesters(id)</w:t>
             </w:r>
           </w:p>
         </w:tc>
@@ -9206,7 +10133,7 @@
                 <w:i w:val="0"/>
                 <w:sz w:val="26"/>
               </w:rPr>
-              <w:t>bigint (FK)</w:t>
+              <w:t>uuid (FK)</w:t>
             </w:r>
           </w:p>
         </w:tc>
@@ -9233,7 +10160,7 @@
                 <w:i w:val="0"/>
                 <w:sz w:val="26"/>
               </w:rPr>
-              <w:t>Foreign key referencing users(user_id); who sent the batch</w:t>
+              <w:t>Foreign key referencing users(id); who sent the batch</w:t>
             </w:r>
           </w:p>
         </w:tc>
@@ -9316,7 +10243,7 @@
                 <w:i w:val="0"/>
                 <w:sz w:val="26"/>
               </w:rPr>
-              <w:t>bigint (FK)</w:t>
+              <w:t>uuid (FK)</w:t>
             </w:r>
           </w:p>
         </w:tc>
@@ -9343,7 +10270,7 @@
                 <w:i w:val="0"/>
                 <w:sz w:val="26"/>
               </w:rPr>
-              <w:t>Foreign key referencing users(user_id); NULL for self-service</w:t>
+              <w:t>Foreign key referencing users(id); NULL for self-service</w:t>
             </w:r>
           </w:p>
         </w:tc>
@@ -9673,7 +10600,7 @@
                 <w:i w:val="0"/>
                 <w:sz w:val="26"/>
               </w:rPr>
-              <w:t>QUEUED, PROCESSING, COMPLETED or FAILED</w:t>
+              <w:t>COMPLETED (default) or FAILED; QUEUED/PROCESSING reserved</w:t>
             </w:r>
           </w:p>
         </w:tc>
@@ -10586,7 +11513,7 @@
           <w:i/>
           <w:sz w:val="26"/>
         </w:rPr>
-        <w:t>Table 10. Schedule Import Staging Table</w:t>
+        <w:t>Table 11. Schedule Import Staging Table</w:t>
       </w:r>
     </w:p>
     <w:tbl>
@@ -10766,7 +11693,7 @@
                 <w:i w:val="0"/>
                 <w:sz w:val="26"/>
               </w:rPr>
-              <w:t>staging_id</w:t>
+              <w:t>id</w:t>
             </w:r>
           </w:p>
         </w:tc>
@@ -10793,7 +11720,7 @@
                 <w:i w:val="0"/>
                 <w:sz w:val="26"/>
               </w:rPr>
-              <w:t>bigint (PK)</w:t>
+              <w:t>uuid (PK)</w:t>
             </w:r>
           </w:p>
         </w:tc>
@@ -10903,7 +11830,7 @@
                 <w:i w:val="0"/>
                 <w:sz w:val="26"/>
               </w:rPr>
-              <w:t>bigint (FK)</w:t>
+              <w:t>uuid (FK)</w:t>
             </w:r>
           </w:p>
         </w:tc>
@@ -10930,7 +11857,7 @@
                 <w:i w:val="0"/>
                 <w:sz w:val="26"/>
               </w:rPr>
-              <w:t>Foreign key referencing schedule_imports(import_id)</w:t>
+              <w:t>Foreign key referencing schedule_imports(id)</w:t>
             </w:r>
           </w:p>
         </w:tc>
@@ -11123,7 +12050,7 @@
                 <w:i w:val="0"/>
                 <w:sz w:val="26"/>
               </w:rPr>
-              <w:t>bigint (FK)</w:t>
+              <w:t>uuid (FK)</w:t>
             </w:r>
           </w:p>
         </w:tc>
@@ -11150,7 +12077,7 @@
                 <w:i w:val="0"/>
                 <w:sz w:val="26"/>
               </w:rPr>
-              <w:t>Foreign key referencing users(user_id)</w:t>
+              <w:t>Foreign key referencing users(id)</w:t>
             </w:r>
           </w:p>
         </w:tc>
@@ -11233,7 +12160,7 @@
                 <w:i w:val="0"/>
                 <w:sz w:val="26"/>
               </w:rPr>
-              <w:t>bigint (FK)</w:t>
+              <w:t>uuid (FK)</w:t>
             </w:r>
           </w:p>
         </w:tc>
@@ -11260,7 +12187,7 @@
                 <w:i w:val="0"/>
                 <w:sz w:val="26"/>
               </w:rPr>
-              <w:t>Foreign key referencing semesters(semester_id)</w:t>
+              <w:t>Foreign key referencing semesters(id)</w:t>
             </w:r>
           </w:p>
         </w:tc>
@@ -11866,7 +12793,7 @@
                 <w:i w:val="0"/>
                 <w:sz w:val="26"/>
               </w:rPr>
-              <w:t>start_time</w:t>
+              <w:t>date_label</w:t>
             </w:r>
           </w:p>
         </w:tc>
@@ -11893,7 +12820,7 @@
                 <w:i w:val="0"/>
                 <w:sz w:val="26"/>
               </w:rPr>
-              <w:t>time</w:t>
+              <w:t>varchar(20)</w:t>
             </w:r>
           </w:p>
         </w:tc>
@@ -11920,7 +12847,7 @@
                 <w:i w:val="0"/>
                 <w:sz w:val="26"/>
               </w:rPr>
-              <w:t>Block start time</w:t>
+              <w:t>Calendar date printed in the source timetable</w:t>
             </w:r>
           </w:p>
         </w:tc>
@@ -11976,7 +12903,7 @@
                 <w:i w:val="0"/>
                 <w:sz w:val="26"/>
               </w:rPr>
-              <w:t>end_time</w:t>
+              <w:t>start_time</w:t>
             </w:r>
           </w:p>
         </w:tc>
@@ -12030,7 +12957,7 @@
                 <w:i w:val="0"/>
                 <w:sz w:val="26"/>
               </w:rPr>
-              <w:t>Block end time</w:t>
+              <w:t>Block start time</w:t>
             </w:r>
           </w:p>
         </w:tc>
@@ -12086,7 +13013,7 @@
                 <w:i w:val="0"/>
                 <w:sz w:val="26"/>
               </w:rPr>
-              <w:t>room</w:t>
+              <w:t>end_time</w:t>
             </w:r>
           </w:p>
         </w:tc>
@@ -12113,7 +13040,7 @@
                 <w:i w:val="0"/>
                 <w:sz w:val="26"/>
               </w:rPr>
-              <w:t>varchar(100)</w:t>
+              <w:t>time</w:t>
             </w:r>
           </w:p>
         </w:tc>
@@ -12140,7 +13067,7 @@
                 <w:i w:val="0"/>
                 <w:sz w:val="26"/>
               </w:rPr>
-              <w:t>Room or online link</w:t>
+              <w:t>Block end time</w:t>
             </w:r>
           </w:p>
         </w:tc>
@@ -12196,7 +13123,7 @@
                 <w:i w:val="0"/>
                 <w:sz w:val="26"/>
               </w:rPr>
-              <w:t>location_type</w:t>
+              <w:t>room</w:t>
             </w:r>
           </w:p>
         </w:tc>
@@ -12223,7 +13150,7 @@
                 <w:i w:val="0"/>
                 <w:sz w:val="26"/>
               </w:rPr>
-              <w:t>enum</w:t>
+              <w:t>varchar(100)</w:t>
             </w:r>
           </w:p>
         </w:tc>
@@ -12250,7 +13177,7 @@
                 <w:i w:val="0"/>
                 <w:sz w:val="26"/>
               </w:rPr>
-              <w:t>LAB, ROOM, ONLINE or OTHER</w:t>
+              <w:t>Room or online link</w:t>
             </w:r>
           </w:p>
         </w:tc>
@@ -12306,7 +13233,7 @@
                 <w:i w:val="0"/>
                 <w:sz w:val="26"/>
               </w:rPr>
-              <w:t>lecturer_name</w:t>
+              <w:t>location_type</w:t>
             </w:r>
           </w:p>
         </w:tc>
@@ -12333,7 +13260,7 @@
                 <w:i w:val="0"/>
                 <w:sz w:val="26"/>
               </w:rPr>
-              <w:t>varchar(150)</w:t>
+              <w:t>enum</w:t>
             </w:r>
           </w:p>
         </w:tc>
@@ -12360,7 +13287,7 @@
                 <w:i w:val="0"/>
                 <w:sz w:val="26"/>
               </w:rPr>
-              <w:t>Instructor of the class</w:t>
+              <w:t>LAB, ROOM, ONLINE or OTHER</w:t>
             </w:r>
           </w:p>
         </w:tc>
@@ -12416,7 +13343,7 @@
                 <w:i w:val="0"/>
                 <w:sz w:val="26"/>
               </w:rPr>
-              <w:t>status</w:t>
+              <w:t>lecturer_name</w:t>
             </w:r>
           </w:p>
         </w:tc>
@@ -12443,7 +13370,7 @@
                 <w:i w:val="0"/>
                 <w:sz w:val="26"/>
               </w:rPr>
-              <w:t>enum</w:t>
+              <w:t>varchar(150)</w:t>
             </w:r>
           </w:p>
         </w:tc>
@@ -12470,7 +13397,7 @@
                 <w:i w:val="0"/>
                 <w:sz w:val="26"/>
               </w:rPr>
-              <w:t>VALID, DUPLICATE, CONFLICT or INVALID</w:t>
+              <w:t>Instructor of the class</w:t>
             </w:r>
           </w:p>
         </w:tc>
@@ -12526,7 +13453,7 @@
                 <w:i w:val="0"/>
                 <w:sz w:val="26"/>
               </w:rPr>
-              <w:t>conflict_notes</w:t>
+              <w:t>status</w:t>
             </w:r>
           </w:p>
         </w:tc>
@@ -12553,7 +13480,7 @@
                 <w:i w:val="0"/>
                 <w:sz w:val="26"/>
               </w:rPr>
-              <w:t>text</w:t>
+              <w:t>enum</w:t>
             </w:r>
           </w:p>
         </w:tc>
@@ -12580,7 +13507,7 @@
                 <w:i w:val="0"/>
                 <w:sz w:val="26"/>
               </w:rPr>
-              <w:t>Explanation for non-valid rows</w:t>
+              <w:t>VALID, DUPLICATE, CONFLICT or INVALID</w:t>
             </w:r>
           </w:p>
         </w:tc>
@@ -12610,6 +13537,116 @@
                 <w:sz w:val="26"/>
               </w:rPr>
               <w:t>18</w:t>
+            </w:r>
+          </w:p>
+        </w:tc>
+        <w:tc>
+          <w:tcPr>
+            <w:tcW w:type="dxa" w:w="2736"/>
+            <w:tcBorders>
+              <w:top w:val="single" w:sz="6" w:color="000000"/>
+              <w:left w:val="single" w:sz="6" w:color="000000"/>
+              <w:bottom w:val="single" w:sz="6" w:color="000000"/>
+              <w:right w:val="single" w:sz="6" w:color="000000"/>
+            </w:tcBorders>
+          </w:tcPr>
+          <w:p>
+            <w:pPr>
+              <w:spacing w:before="60" w:after="60"/>
+              <w:jc w:val="left"/>
+            </w:pPr>
+            <w:r/>
+            <w:r>
+              <w:rPr>
+                <w:rFonts w:ascii="Times New Roman" w:hAnsi="Times New Roman" w:eastAsia="Times New Roman"/>
+                <w:b w:val="0"/>
+                <w:i w:val="0"/>
+                <w:sz w:val="26"/>
+              </w:rPr>
+              <w:t>conflict_notes</w:t>
+            </w:r>
+          </w:p>
+        </w:tc>
+        <w:tc>
+          <w:tcPr>
+            <w:tcW w:type="dxa" w:w="2160"/>
+            <w:tcBorders>
+              <w:top w:val="single" w:sz="6" w:color="000000"/>
+              <w:left w:val="single" w:sz="6" w:color="000000"/>
+              <w:bottom w:val="single" w:sz="6" w:color="000000"/>
+              <w:right w:val="single" w:sz="6" w:color="000000"/>
+            </w:tcBorders>
+          </w:tcPr>
+          <w:p>
+            <w:pPr>
+              <w:spacing w:before="60" w:after="60"/>
+              <w:jc w:val="left"/>
+            </w:pPr>
+            <w:r/>
+            <w:r>
+              <w:rPr>
+                <w:rFonts w:ascii="Times New Roman" w:hAnsi="Times New Roman" w:eastAsia="Times New Roman"/>
+                <w:b w:val="0"/>
+                <w:i w:val="0"/>
+                <w:sz w:val="26"/>
+              </w:rPr>
+              <w:t>text</w:t>
+            </w:r>
+          </w:p>
+        </w:tc>
+        <w:tc>
+          <w:tcPr>
+            <w:tcW w:type="dxa" w:w="4320"/>
+            <w:tcBorders>
+              <w:top w:val="single" w:sz="6" w:color="000000"/>
+              <w:left w:val="single" w:sz="6" w:color="000000"/>
+              <w:bottom w:val="single" w:sz="6" w:color="000000"/>
+              <w:right w:val="single" w:sz="6" w:color="000000"/>
+            </w:tcBorders>
+          </w:tcPr>
+          <w:p>
+            <w:pPr>
+              <w:spacing w:before="60" w:after="60"/>
+              <w:jc w:val="left"/>
+            </w:pPr>
+            <w:r/>
+            <w:r>
+              <w:rPr>
+                <w:rFonts w:ascii="Times New Roman" w:hAnsi="Times New Roman" w:eastAsia="Times New Roman"/>
+                <w:b w:val="0"/>
+                <w:i w:val="0"/>
+                <w:sz w:val="26"/>
+              </w:rPr>
+              <w:t>Explanation for non-valid rows</w:t>
+            </w:r>
+          </w:p>
+        </w:tc>
+      </w:tr>
+      <w:tr>
+        <w:tc>
+          <w:tcPr>
+            <w:tcW w:type="dxa" w:w="864"/>
+            <w:tcBorders>
+              <w:top w:val="single" w:sz="6" w:color="000000"/>
+              <w:left w:val="single" w:sz="6" w:color="000000"/>
+              <w:bottom w:val="single" w:sz="6" w:color="000000"/>
+              <w:right w:val="single" w:sz="6" w:color="000000"/>
+            </w:tcBorders>
+          </w:tcPr>
+          <w:p>
+            <w:pPr>
+              <w:spacing w:before="60" w:after="60"/>
+              <w:jc w:val="center"/>
+            </w:pPr>
+            <w:r/>
+            <w:r>
+              <w:rPr>
+                <w:rFonts w:ascii="Times New Roman" w:hAnsi="Times New Roman" w:eastAsia="Times New Roman"/>
+                <w:b w:val="0"/>
+                <w:i w:val="0"/>
+                <w:sz w:val="26"/>
+              </w:rPr>
+              <w:t>19</w:t>
             </w:r>
           </w:p>
         </w:tc>
@@ -12723,7 +13760,7 @@
           <w:i/>
           <w:sz w:val="26"/>
         </w:rPr>
-        <w:t>Table 11. Bookings Table</w:t>
+        <w:t>Table 12. Bookings Table</w:t>
       </w:r>
     </w:p>
     <w:tbl>
@@ -12903,7 +13940,7 @@
                 <w:i w:val="0"/>
                 <w:sz w:val="26"/>
               </w:rPr>
-              <w:t>booking_id</w:t>
+              <w:t>id</w:t>
             </w:r>
           </w:p>
         </w:tc>
@@ -12930,7 +13967,7 @@
                 <w:i w:val="0"/>
                 <w:sz w:val="26"/>
               </w:rPr>
-              <w:t>bigint (PK)</w:t>
+              <w:t>uuid (PK)</w:t>
             </w:r>
           </w:p>
         </w:tc>
@@ -13013,7 +14050,7 @@
                 <w:i w:val="0"/>
                 <w:sz w:val="26"/>
               </w:rPr>
-              <w:t>slot_id</w:t>
+              <w:t>lecturer_id</w:t>
             </w:r>
           </w:p>
         </w:tc>
@@ -13040,7 +14077,7 @@
                 <w:i w:val="0"/>
                 <w:sz w:val="26"/>
               </w:rPr>
-              <w:t>bigint (FK)</w:t>
+              <w:t>uuid (FK)</w:t>
             </w:r>
           </w:p>
         </w:tc>
@@ -13067,7 +14104,7 @@
                 <w:i w:val="0"/>
                 <w:sz w:val="26"/>
               </w:rPr>
-              <w:t>Foreign key referencing slots(slot_id)</w:t>
+              <w:t>Foreign key referencing users(id); denormalized from slots</w:t>
             </w:r>
           </w:p>
         </w:tc>
@@ -13123,7 +14160,7 @@
                 <w:i w:val="0"/>
                 <w:sz w:val="26"/>
               </w:rPr>
-              <w:t>student_id</w:t>
+              <w:t>recurring_booking_id</w:t>
             </w:r>
           </w:p>
         </w:tc>
@@ -13150,7 +14187,7 @@
                 <w:i w:val="0"/>
                 <w:sz w:val="26"/>
               </w:rPr>
-              <w:t>bigint (FK)</w:t>
+              <w:t>uuid (FK)</w:t>
             </w:r>
           </w:p>
         </w:tc>
@@ -13177,7 +14214,7 @@
                 <w:i w:val="0"/>
                 <w:sz w:val="26"/>
               </w:rPr>
-              <w:t>Foreign key referencing users(user_id); the requester</w:t>
+              <w:t>Foreign key referencing recurring_bookings(id); NULL for one-off bookings</w:t>
             </w:r>
           </w:p>
         </w:tc>
@@ -13233,7 +14270,7 @@
                 <w:i w:val="0"/>
                 <w:sz w:val="26"/>
               </w:rPr>
-              <w:t>semester_id</w:t>
+              <w:t>slot_id</w:t>
             </w:r>
           </w:p>
         </w:tc>
@@ -13260,7 +14297,7 @@
                 <w:i w:val="0"/>
                 <w:sz w:val="26"/>
               </w:rPr>
-              <w:t>bigint (FK)</w:t>
+              <w:t>uuid (FK)</w:t>
             </w:r>
           </w:p>
         </w:tc>
@@ -13287,7 +14324,7 @@
                 <w:i w:val="0"/>
                 <w:sz w:val="26"/>
               </w:rPr>
-              <w:t>Foreign key referencing semesters(semester_id)</w:t>
+              <w:t>Foreign key referencing slots(id)</w:t>
             </w:r>
           </w:p>
         </w:tc>
@@ -13343,7 +14380,7 @@
                 <w:i w:val="0"/>
                 <w:sz w:val="26"/>
               </w:rPr>
-              <w:t>status</w:t>
+              <w:t>student_id</w:t>
             </w:r>
           </w:p>
         </w:tc>
@@ -13370,7 +14407,7 @@
                 <w:i w:val="0"/>
                 <w:sz w:val="26"/>
               </w:rPr>
-              <w:t>enum</w:t>
+              <w:t>uuid (FK)</w:t>
             </w:r>
           </w:p>
         </w:tc>
@@ -13397,7 +14434,7 @@
                 <w:i w:val="0"/>
                 <w:sz w:val="26"/>
               </w:rPr>
-              <w:t>PENDING, CONFIRMED, DECLINED, CANCELLED, COMPLETED or NO_SHOW</w:t>
+              <w:t>Foreign key referencing users(id); the requester</w:t>
             </w:r>
           </w:p>
         </w:tc>
@@ -13453,7 +14490,7 @@
                 <w:i w:val="0"/>
                 <w:sz w:val="26"/>
               </w:rPr>
-              <w:t>is_group</w:t>
+              <w:t>semester_id</w:t>
             </w:r>
           </w:p>
         </w:tc>
@@ -13480,7 +14517,7 @@
                 <w:i w:val="0"/>
                 <w:sz w:val="26"/>
               </w:rPr>
-              <w:t>boolean</w:t>
+              <w:t>uuid (FK)</w:t>
             </w:r>
           </w:p>
         </w:tc>
@@ -13507,7 +14544,7 @@
                 <w:i w:val="0"/>
                 <w:sz w:val="26"/>
               </w:rPr>
-              <w:t>True when several students attend</w:t>
+              <w:t>Foreign key referencing semesters(id)</w:t>
             </w:r>
           </w:p>
         </w:tc>
@@ -13563,7 +14600,7 @@
                 <w:i w:val="0"/>
                 <w:sz w:val="26"/>
               </w:rPr>
-              <w:t>topic</w:t>
+              <w:t>status</w:t>
             </w:r>
           </w:p>
         </w:tc>
@@ -13590,7 +14627,7 @@
                 <w:i w:val="0"/>
                 <w:sz w:val="26"/>
               </w:rPr>
-              <w:t>varchar(255)</w:t>
+              <w:t>enum</w:t>
             </w:r>
           </w:p>
         </w:tc>
@@ -13617,7 +14654,7 @@
                 <w:i w:val="0"/>
                 <w:sz w:val="26"/>
               </w:rPr>
-              <w:t>What the student wants to discuss</w:t>
+              <w:t>PENDING, CONFIRMED, DECLINED, CANCELLED, COMPLETED or NO_SHOW</w:t>
             </w:r>
           </w:p>
         </w:tc>
@@ -13673,7 +14710,7 @@
                 <w:i w:val="0"/>
                 <w:sz w:val="26"/>
               </w:rPr>
-              <w:t>time_range</w:t>
+              <w:t>is_group</w:t>
             </w:r>
           </w:p>
         </w:tc>
@@ -13700,7 +14737,7 @@
                 <w:i w:val="0"/>
                 <w:sz w:val="26"/>
               </w:rPr>
-              <w:t>tstzrange</w:t>
+              <w:t>boolean</w:t>
             </w:r>
           </w:p>
         </w:tc>
@@ -13727,7 +14764,7 @@
                 <w:i w:val="0"/>
                 <w:sz w:val="26"/>
               </w:rPr>
-              <w:t>Copy of the slot interval, used by the double-booking constraint</w:t>
+              <w:t>True when several students attend</w:t>
             </w:r>
           </w:p>
         </w:tc>
@@ -13783,7 +14820,7 @@
                 <w:i w:val="0"/>
                 <w:sz w:val="26"/>
               </w:rPr>
-              <w:t>decline_reason</w:t>
+              <w:t>topic</w:t>
             </w:r>
           </w:p>
         </w:tc>
@@ -13837,7 +14874,7 @@
                 <w:i w:val="0"/>
                 <w:sz w:val="26"/>
               </w:rPr>
-              <w:t>Reason given by the lecturer when declining</w:t>
+              <w:t>What the student wants to discuss</w:t>
             </w:r>
           </w:p>
         </w:tc>
@@ -13893,7 +14930,7 @@
                 <w:i w:val="0"/>
                 <w:sz w:val="26"/>
               </w:rPr>
-              <w:t>created_at</w:t>
+              <w:t>time_range</w:t>
             </w:r>
           </w:p>
         </w:tc>
@@ -13920,7 +14957,7 @@
                 <w:i w:val="0"/>
                 <w:sz w:val="26"/>
               </w:rPr>
-              <w:t>timestamptz</w:t>
+              <w:t>tstzrange</w:t>
             </w:r>
           </w:p>
         </w:tc>
@@ -13947,7 +14984,7 @@
                 <w:i w:val="0"/>
                 <w:sz w:val="26"/>
               </w:rPr>
-              <w:t>Request time</w:t>
+              <w:t>Copy of the slot interval, used by the double-booking constraint</w:t>
             </w:r>
           </w:p>
         </w:tc>
@@ -14003,7 +15040,7 @@
                 <w:i w:val="0"/>
                 <w:sz w:val="26"/>
               </w:rPr>
-              <w:t>confirmed_at</w:t>
+              <w:t>decline_reason</w:t>
             </w:r>
           </w:p>
         </w:tc>
@@ -14030,7 +15067,7 @@
                 <w:i w:val="0"/>
                 <w:sz w:val="26"/>
               </w:rPr>
-              <w:t>timestamptz</w:t>
+              <w:t>varchar(255)</w:t>
             </w:r>
           </w:p>
         </w:tc>
@@ -14057,7 +15094,7 @@
                 <w:i w:val="0"/>
                 <w:sz w:val="26"/>
               </w:rPr>
-              <w:t>Confirmation time</w:t>
+              <w:t>Reason given by the lecturer when declining</w:t>
             </w:r>
           </w:p>
         </w:tc>
@@ -14113,7 +15150,7 @@
                 <w:i w:val="0"/>
                 <w:sz w:val="26"/>
               </w:rPr>
-              <w:t>cancelled_at</w:t>
+              <w:t>created_at</w:t>
             </w:r>
           </w:p>
         </w:tc>
@@ -14167,7 +15204,7 @@
                 <w:i w:val="0"/>
                 <w:sz w:val="26"/>
               </w:rPr>
-              <w:t>Cancellation time</w:t>
+              <w:t>Request time</w:t>
             </w:r>
           </w:p>
         </w:tc>
@@ -14223,6 +15260,226 @@
                 <w:i w:val="0"/>
                 <w:sz w:val="26"/>
               </w:rPr>
+              <w:t>confirmed_at</w:t>
+            </w:r>
+          </w:p>
+        </w:tc>
+        <w:tc>
+          <w:tcPr>
+            <w:tcW w:type="dxa" w:w="2160"/>
+            <w:tcBorders>
+              <w:top w:val="single" w:sz="6" w:color="000000"/>
+              <w:left w:val="single" w:sz="6" w:color="000000"/>
+              <w:bottom w:val="single" w:sz="6" w:color="000000"/>
+              <w:right w:val="single" w:sz="6" w:color="000000"/>
+            </w:tcBorders>
+          </w:tcPr>
+          <w:p>
+            <w:pPr>
+              <w:spacing w:before="60" w:after="60"/>
+              <w:jc w:val="left"/>
+            </w:pPr>
+            <w:r/>
+            <w:r>
+              <w:rPr>
+                <w:rFonts w:ascii="Times New Roman" w:hAnsi="Times New Roman" w:eastAsia="Times New Roman"/>
+                <w:b w:val="0"/>
+                <w:i w:val="0"/>
+                <w:sz w:val="26"/>
+              </w:rPr>
+              <w:t>timestamptz</w:t>
+            </w:r>
+          </w:p>
+        </w:tc>
+        <w:tc>
+          <w:tcPr>
+            <w:tcW w:type="dxa" w:w="4320"/>
+            <w:tcBorders>
+              <w:top w:val="single" w:sz="6" w:color="000000"/>
+              <w:left w:val="single" w:sz="6" w:color="000000"/>
+              <w:bottom w:val="single" w:sz="6" w:color="000000"/>
+              <w:right w:val="single" w:sz="6" w:color="000000"/>
+            </w:tcBorders>
+          </w:tcPr>
+          <w:p>
+            <w:pPr>
+              <w:spacing w:before="60" w:after="60"/>
+              <w:jc w:val="left"/>
+            </w:pPr>
+            <w:r/>
+            <w:r>
+              <w:rPr>
+                <w:rFonts w:ascii="Times New Roman" w:hAnsi="Times New Roman" w:eastAsia="Times New Roman"/>
+                <w:b w:val="0"/>
+                <w:i w:val="0"/>
+                <w:sz w:val="26"/>
+              </w:rPr>
+              <w:t>Confirmation time</w:t>
+            </w:r>
+          </w:p>
+        </w:tc>
+      </w:tr>
+      <w:tr>
+        <w:tc>
+          <w:tcPr>
+            <w:tcW w:type="dxa" w:w="864"/>
+            <w:tcBorders>
+              <w:top w:val="single" w:sz="6" w:color="000000"/>
+              <w:left w:val="single" w:sz="6" w:color="000000"/>
+              <w:bottom w:val="single" w:sz="6" w:color="000000"/>
+              <w:right w:val="single" w:sz="6" w:color="000000"/>
+            </w:tcBorders>
+          </w:tcPr>
+          <w:p>
+            <w:pPr>
+              <w:spacing w:before="60" w:after="60"/>
+              <w:jc w:val="center"/>
+            </w:pPr>
+            <w:r/>
+            <w:r>
+              <w:rPr>
+                <w:rFonts w:ascii="Times New Roman" w:hAnsi="Times New Roman" w:eastAsia="Times New Roman"/>
+                <w:b w:val="0"/>
+                <w:i w:val="0"/>
+                <w:sz w:val="26"/>
+              </w:rPr>
+              <w:t>14</w:t>
+            </w:r>
+          </w:p>
+        </w:tc>
+        <w:tc>
+          <w:tcPr>
+            <w:tcW w:type="dxa" w:w="2736"/>
+            <w:tcBorders>
+              <w:top w:val="single" w:sz="6" w:color="000000"/>
+              <w:left w:val="single" w:sz="6" w:color="000000"/>
+              <w:bottom w:val="single" w:sz="6" w:color="000000"/>
+              <w:right w:val="single" w:sz="6" w:color="000000"/>
+            </w:tcBorders>
+          </w:tcPr>
+          <w:p>
+            <w:pPr>
+              <w:spacing w:before="60" w:after="60"/>
+              <w:jc w:val="left"/>
+            </w:pPr>
+            <w:r/>
+            <w:r>
+              <w:rPr>
+                <w:rFonts w:ascii="Times New Roman" w:hAnsi="Times New Roman" w:eastAsia="Times New Roman"/>
+                <w:b w:val="0"/>
+                <w:i w:val="0"/>
+                <w:sz w:val="26"/>
+              </w:rPr>
+              <w:t>cancelled_at</w:t>
+            </w:r>
+          </w:p>
+        </w:tc>
+        <w:tc>
+          <w:tcPr>
+            <w:tcW w:type="dxa" w:w="2160"/>
+            <w:tcBorders>
+              <w:top w:val="single" w:sz="6" w:color="000000"/>
+              <w:left w:val="single" w:sz="6" w:color="000000"/>
+              <w:bottom w:val="single" w:sz="6" w:color="000000"/>
+              <w:right w:val="single" w:sz="6" w:color="000000"/>
+            </w:tcBorders>
+          </w:tcPr>
+          <w:p>
+            <w:pPr>
+              <w:spacing w:before="60" w:after="60"/>
+              <w:jc w:val="left"/>
+            </w:pPr>
+            <w:r/>
+            <w:r>
+              <w:rPr>
+                <w:rFonts w:ascii="Times New Roman" w:hAnsi="Times New Roman" w:eastAsia="Times New Roman"/>
+                <w:b w:val="0"/>
+                <w:i w:val="0"/>
+                <w:sz w:val="26"/>
+              </w:rPr>
+              <w:t>timestamptz</w:t>
+            </w:r>
+          </w:p>
+        </w:tc>
+        <w:tc>
+          <w:tcPr>
+            <w:tcW w:type="dxa" w:w="4320"/>
+            <w:tcBorders>
+              <w:top w:val="single" w:sz="6" w:color="000000"/>
+              <w:left w:val="single" w:sz="6" w:color="000000"/>
+              <w:bottom w:val="single" w:sz="6" w:color="000000"/>
+              <w:right w:val="single" w:sz="6" w:color="000000"/>
+            </w:tcBorders>
+          </w:tcPr>
+          <w:p>
+            <w:pPr>
+              <w:spacing w:before="60" w:after="60"/>
+              <w:jc w:val="left"/>
+            </w:pPr>
+            <w:r/>
+            <w:r>
+              <w:rPr>
+                <w:rFonts w:ascii="Times New Roman" w:hAnsi="Times New Roman" w:eastAsia="Times New Roman"/>
+                <w:b w:val="0"/>
+                <w:i w:val="0"/>
+                <w:sz w:val="26"/>
+              </w:rPr>
+              <w:t>Cancellation time</w:t>
+            </w:r>
+          </w:p>
+        </w:tc>
+      </w:tr>
+      <w:tr>
+        <w:tc>
+          <w:tcPr>
+            <w:tcW w:type="dxa" w:w="864"/>
+            <w:tcBorders>
+              <w:top w:val="single" w:sz="6" w:color="000000"/>
+              <w:left w:val="single" w:sz="6" w:color="000000"/>
+              <w:bottom w:val="single" w:sz="6" w:color="000000"/>
+              <w:right w:val="single" w:sz="6" w:color="000000"/>
+            </w:tcBorders>
+          </w:tcPr>
+          <w:p>
+            <w:pPr>
+              <w:spacing w:before="60" w:after="60"/>
+              <w:jc w:val="center"/>
+            </w:pPr>
+            <w:r/>
+            <w:r>
+              <w:rPr>
+                <w:rFonts w:ascii="Times New Roman" w:hAnsi="Times New Roman" w:eastAsia="Times New Roman"/>
+                <w:b w:val="0"/>
+                <w:i w:val="0"/>
+                <w:sz w:val="26"/>
+              </w:rPr>
+              <w:t>15</w:t>
+            </w:r>
+          </w:p>
+        </w:tc>
+        <w:tc>
+          <w:tcPr>
+            <w:tcW w:type="dxa" w:w="2736"/>
+            <w:tcBorders>
+              <w:top w:val="single" w:sz="6" w:color="000000"/>
+              <w:left w:val="single" w:sz="6" w:color="000000"/>
+              <w:bottom w:val="single" w:sz="6" w:color="000000"/>
+              <w:right w:val="single" w:sz="6" w:color="000000"/>
+            </w:tcBorders>
+          </w:tcPr>
+          <w:p>
+            <w:pPr>
+              <w:spacing w:before="60" w:after="60"/>
+              <w:jc w:val="left"/>
+            </w:pPr>
+            <w:r/>
+            <w:r>
+              <w:rPr>
+                <w:rFonts w:ascii="Times New Roman" w:hAnsi="Times New Roman" w:eastAsia="Times New Roman"/>
+                <w:b w:val="0"/>
+                <w:i w:val="0"/>
+                <w:sz w:val="26"/>
+              </w:rPr>
               <w:t>cancelled_by</w:t>
             </w:r>
           </w:p>
@@ -14250,7 +15507,7 @@
                 <w:i w:val="0"/>
                 <w:sz w:val="26"/>
               </w:rPr>
-              <w:t>bigint (FK)</w:t>
+              <w:t>uuid (FK)</w:t>
             </w:r>
           </w:p>
         </w:tc>
@@ -14277,7 +15534,7 @@
                 <w:i w:val="0"/>
                 <w:sz w:val="26"/>
               </w:rPr>
-              <w:t>Foreign key referencing users(user_id)</w:t>
+              <w:t>Foreign key referencing users(id)</w:t>
             </w:r>
           </w:p>
         </w:tc>
@@ -14310,7 +15567,7 @@
           <w:i/>
           <w:sz w:val="26"/>
         </w:rPr>
-        <w:t>Table 12. Booking Participants Table</w:t>
+        <w:t>Table 13. Booking Participants Table</w:t>
       </w:r>
     </w:p>
     <w:tbl>
@@ -14517,7 +15774,7 @@
                 <w:i w:val="0"/>
                 <w:sz w:val="26"/>
               </w:rPr>
-              <w:t>bigint (PK, FK)</w:t>
+              <w:t>uuid (PK, FK)</w:t>
             </w:r>
           </w:p>
         </w:tc>
@@ -14544,7 +15801,7 @@
                 <w:i w:val="0"/>
                 <w:sz w:val="26"/>
               </w:rPr>
-              <w:t>Foreign key referencing bookings(booking_id)</w:t>
+              <w:t>Foreign key referencing bookings(id)</w:t>
             </w:r>
           </w:p>
         </w:tc>
@@ -14627,7 +15884,7 @@
                 <w:i w:val="0"/>
                 <w:sz w:val="26"/>
               </w:rPr>
-              <w:t>bigint (PK, FK)</w:t>
+              <w:t>uuid (PK, FK)</w:t>
             </w:r>
           </w:p>
         </w:tc>
@@ -14654,7 +15911,7 @@
                 <w:i w:val="0"/>
                 <w:sz w:val="26"/>
               </w:rPr>
-              <w:t>Foreign key referencing users(user_id); added by email</w:t>
+              <w:t>Foreign key referencing users(id); added by email</w:t>
             </w:r>
           </w:p>
         </w:tc>
@@ -14797,7 +16054,7 @@
           <w:i/>
           <w:sz w:val="26"/>
         </w:rPr>
-        <w:t>Table 13. Meeting Records Table</w:t>
+        <w:t>Table 14. Meeting Records Table</w:t>
       </w:r>
     </w:p>
     <w:tbl>
@@ -14977,7 +16234,7 @@
                 <w:i w:val="0"/>
                 <w:sz w:val="26"/>
               </w:rPr>
-              <w:t>record_id</w:t>
+              <w:t>id</w:t>
             </w:r>
           </w:p>
         </w:tc>
@@ -15004,7 +16261,7 @@
                 <w:i w:val="0"/>
                 <w:sz w:val="26"/>
               </w:rPr>
-              <w:t>bigint (PK)</w:t>
+              <w:t>uuid (PK)</w:t>
             </w:r>
           </w:p>
         </w:tc>
@@ -15114,7 +16371,7 @@
                 <w:i w:val="0"/>
                 <w:sz w:val="26"/>
               </w:rPr>
-              <w:t>bigint (FK, UK)</w:t>
+              <w:t>uuid (FK, UK)</w:t>
             </w:r>
           </w:p>
         </w:tc>
@@ -15141,7 +16398,7 @@
                 <w:i w:val="0"/>
                 <w:sz w:val="26"/>
               </w:rPr>
-              <w:t>Foreign key referencing bookings(booking_id)</w:t>
+              <w:t>Foreign key referencing bookings(id)</w:t>
             </w:r>
           </w:p>
         </w:tc>
@@ -15504,7 +16761,7 @@
           <w:i/>
           <w:sz w:val="26"/>
         </w:rPr>
-        <w:t>Table 14. Recurring Bookings Table</w:t>
+        <w:t>Table 15. Recurring Bookings Table</w:t>
       </w:r>
     </w:p>
     <w:tbl>
@@ -15684,7 +16941,7 @@
                 <w:i w:val="0"/>
                 <w:sz w:val="26"/>
               </w:rPr>
-              <w:t>recurring_id</w:t>
+              <w:t>id</w:t>
             </w:r>
           </w:p>
         </w:tc>
@@ -15711,7 +16968,7 @@
                 <w:i w:val="0"/>
                 <w:sz w:val="26"/>
               </w:rPr>
-              <w:t>bigint (PK)</w:t>
+              <w:t>uuid (PK)</w:t>
             </w:r>
           </w:p>
         </w:tc>
@@ -15821,7 +17078,7 @@
                 <w:i w:val="0"/>
                 <w:sz w:val="26"/>
               </w:rPr>
-              <w:t>bigint (FK)</w:t>
+              <w:t>uuid (FK)</w:t>
             </w:r>
           </w:p>
         </w:tc>
@@ -15848,7 +17105,7 @@
                 <w:i w:val="0"/>
                 <w:sz w:val="26"/>
               </w:rPr>
-              <w:t>Foreign key referencing users(user_id)</w:t>
+              <w:t>Foreign key referencing users(id)</w:t>
             </w:r>
           </w:p>
         </w:tc>
@@ -15931,7 +17188,7 @@
                 <w:i w:val="0"/>
                 <w:sz w:val="26"/>
               </w:rPr>
-              <w:t>bigint (FK)</w:t>
+              <w:t>uuid (FK)</w:t>
             </w:r>
           </w:p>
         </w:tc>
@@ -15958,7 +17215,7 @@
                 <w:i w:val="0"/>
                 <w:sz w:val="26"/>
               </w:rPr>
-              <w:t>Foreign key referencing users(user_id)</w:t>
+              <w:t>Foreign key referencing users(id)</w:t>
             </w:r>
           </w:p>
         </w:tc>
@@ -16041,7 +17298,7 @@
                 <w:i w:val="0"/>
                 <w:sz w:val="26"/>
               </w:rPr>
-              <w:t>bigint (FK)</w:t>
+              <w:t>uuid (FK)</w:t>
             </w:r>
           </w:p>
         </w:tc>
@@ -16068,7 +17325,7 @@
                 <w:i w:val="0"/>
                 <w:sz w:val="26"/>
               </w:rPr>
-              <w:t>Foreign key referencing semesters(semester_id)</w:t>
+              <w:t>Foreign key referencing semesters(id)</w:t>
             </w:r>
           </w:p>
         </w:tc>
@@ -16651,7 +17908,7 @@
           <w:i/>
           <w:sz w:val="26"/>
         </w:rPr>
-        <w:t>Table 15. Waitlist Entries Table</w:t>
+        <w:t>Table 16. Waitlist Entries Table</w:t>
       </w:r>
     </w:p>
     <w:tbl>
@@ -16831,7 +18088,7 @@
                 <w:i w:val="0"/>
                 <w:sz w:val="26"/>
               </w:rPr>
-              <w:t>waitlist_id</w:t>
+              <w:t>id</w:t>
             </w:r>
           </w:p>
         </w:tc>
@@ -16858,7 +18115,7 @@
                 <w:i w:val="0"/>
                 <w:sz w:val="26"/>
               </w:rPr>
-              <w:t>bigint (PK)</w:t>
+              <w:t>uuid (PK)</w:t>
             </w:r>
           </w:p>
         </w:tc>
@@ -16968,7 +18225,7 @@
                 <w:i w:val="0"/>
                 <w:sz w:val="26"/>
               </w:rPr>
-              <w:t>bigint (FK)</w:t>
+              <w:t>uuid (FK)</w:t>
             </w:r>
           </w:p>
         </w:tc>
@@ -16995,7 +18252,7 @@
                 <w:i w:val="0"/>
                 <w:sz w:val="26"/>
               </w:rPr>
-              <w:t>Foreign key referencing slots(slot_id)</w:t>
+              <w:t>Foreign key referencing slots(id)</w:t>
             </w:r>
           </w:p>
         </w:tc>
@@ -17078,7 +18335,7 @@
                 <w:i w:val="0"/>
                 <w:sz w:val="26"/>
               </w:rPr>
-              <w:t>bigint (FK)</w:t>
+              <w:t>uuid (FK)</w:t>
             </w:r>
           </w:p>
         </w:tc>
@@ -17105,7 +18362,7 @@
                 <w:i w:val="0"/>
                 <w:sz w:val="26"/>
               </w:rPr>
-              <w:t>Foreign key referencing users(user_id)</w:t>
+              <w:t>Foreign key referencing users(id)</w:t>
             </w:r>
           </w:p>
         </w:tc>
@@ -17688,7 +18945,7 @@
           <w:i/>
           <w:sz w:val="26"/>
         </w:rPr>
-        <w:t>Table 16. Allocation Policies Table</w:t>
+        <w:t>Table 17. Allocation Policies Table</w:t>
       </w:r>
     </w:p>
     <w:tbl>
@@ -17868,7 +19125,7 @@
                 <w:i w:val="0"/>
                 <w:sz w:val="26"/>
               </w:rPr>
-              <w:t>policy_id</w:t>
+              <w:t>id</w:t>
             </w:r>
           </w:p>
         </w:tc>
@@ -17895,7 +19152,7 @@
                 <w:i w:val="0"/>
                 <w:sz w:val="26"/>
               </w:rPr>
-              <w:t>bigint (PK)</w:t>
+              <w:t>uuid (PK)</w:t>
             </w:r>
           </w:p>
         </w:tc>
@@ -18285,7 +19542,7 @@
           <w:i/>
           <w:sz w:val="26"/>
         </w:rPr>
-        <w:t>Table 17. Allocation Events Table</w:t>
+        <w:t>Table 18. Allocation Events Table</w:t>
       </w:r>
     </w:p>
     <w:tbl>
@@ -18465,7 +19722,7 @@
                 <w:i w:val="0"/>
                 <w:sz w:val="26"/>
               </w:rPr>
-              <w:t>event_id</w:t>
+              <w:t>id</w:t>
             </w:r>
           </w:p>
         </w:tc>
@@ -18492,7 +19749,7 @@
                 <w:i w:val="0"/>
                 <w:sz w:val="26"/>
               </w:rPr>
-              <w:t>bigint (PK)</w:t>
+              <w:t>uuid (PK)</w:t>
             </w:r>
           </w:p>
         </w:tc>
@@ -18602,7 +19859,7 @@
                 <w:i w:val="0"/>
                 <w:sz w:val="26"/>
               </w:rPr>
-              <w:t>bigint (FK)</w:t>
+              <w:t>uuid (FK)</w:t>
             </w:r>
           </w:p>
         </w:tc>
@@ -18629,7 +19886,7 @@
                 <w:i w:val="0"/>
                 <w:sz w:val="26"/>
               </w:rPr>
-              <w:t>Foreign key referencing waitlist_entries(waitlist_id)</w:t>
+              <w:t>Foreign key referencing waitlist_entries(id)</w:t>
             </w:r>
           </w:p>
         </w:tc>
@@ -18712,7 +19969,7 @@
                 <w:i w:val="0"/>
                 <w:sz w:val="26"/>
               </w:rPr>
-              <w:t>bigint (FK)</w:t>
+              <w:t>uuid (FK)</w:t>
             </w:r>
           </w:p>
         </w:tc>
@@ -18739,7 +19996,7 @@
                 <w:i w:val="0"/>
                 <w:sz w:val="26"/>
               </w:rPr>
-              <w:t>Foreign key referencing allocation_policies(policy_id)</w:t>
+              <w:t>Foreign key referencing allocation_policies(id)</w:t>
             </w:r>
           </w:p>
         </w:tc>
@@ -19152,7 +20409,7 @@
                 <w:i w:val="0"/>
                 <w:sz w:val="26"/>
               </w:rPr>
-              <w:t>bigint (FK)</w:t>
+              <w:t>uuid (FK)</w:t>
             </w:r>
           </w:p>
         </w:tc>
@@ -19179,7 +20436,7 @@
                 <w:i w:val="0"/>
                 <w:sz w:val="26"/>
               </w:rPr>
-              <w:t>Foreign key referencing users(user_id); the admin who overrode</w:t>
+              <w:t>Foreign key referencing users(id); the admin who overrode</w:t>
             </w:r>
           </w:p>
         </w:tc>
@@ -19235,7 +20492,117 @@
                 <w:i w:val="0"/>
                 <w:sz w:val="26"/>
               </w:rPr>
-              <w:t>created_at</w:t>
+              <w:t>override_reason</w:t>
+            </w:r>
+          </w:p>
+        </w:tc>
+        <w:tc>
+          <w:tcPr>
+            <w:tcW w:type="dxa" w:w="2160"/>
+            <w:tcBorders>
+              <w:top w:val="single" w:sz="6" w:color="000000"/>
+              <w:left w:val="single" w:sz="6" w:color="000000"/>
+              <w:bottom w:val="single" w:sz="6" w:color="000000"/>
+              <w:right w:val="single" w:sz="6" w:color="000000"/>
+            </w:tcBorders>
+          </w:tcPr>
+          <w:p>
+            <w:pPr>
+              <w:spacing w:before="60" w:after="60"/>
+              <w:jc w:val="left"/>
+            </w:pPr>
+            <w:r/>
+            <w:r>
+              <w:rPr>
+                <w:rFonts w:ascii="Times New Roman" w:hAnsi="Times New Roman" w:eastAsia="Times New Roman"/>
+                <w:b w:val="0"/>
+                <w:i w:val="0"/>
+                <w:sz w:val="26"/>
+              </w:rPr>
+              <w:t>varchar(255)</w:t>
+            </w:r>
+          </w:p>
+        </w:tc>
+        <w:tc>
+          <w:tcPr>
+            <w:tcW w:type="dxa" w:w="4320"/>
+            <w:tcBorders>
+              <w:top w:val="single" w:sz="6" w:color="000000"/>
+              <w:left w:val="single" w:sz="6" w:color="000000"/>
+              <w:bottom w:val="single" w:sz="6" w:color="000000"/>
+              <w:right w:val="single" w:sz="6" w:color="000000"/>
+            </w:tcBorders>
+          </w:tcPr>
+          <w:p>
+            <w:pPr>
+              <w:spacing w:before="60" w:after="60"/>
+              <w:jc w:val="left"/>
+            </w:pPr>
+            <w:r/>
+            <w:r>
+              <w:rPr>
+                <w:rFonts w:ascii="Times New Roman" w:hAnsi="Times New Roman" w:eastAsia="Times New Roman"/>
+                <w:b w:val="0"/>
+                <w:i w:val="0"/>
+                <w:sz w:val="26"/>
+              </w:rPr>
+              <w:t>Required only for OVERRIDDEN decisions</w:t>
+            </w:r>
+          </w:p>
+        </w:tc>
+      </w:tr>
+      <w:tr>
+        <w:tc>
+          <w:tcPr>
+            <w:tcW w:type="dxa" w:w="864"/>
+            <w:tcBorders>
+              <w:top w:val="single" w:sz="6" w:color="000000"/>
+              <w:left w:val="single" w:sz="6" w:color="000000"/>
+              <w:bottom w:val="single" w:sz="6" w:color="000000"/>
+              <w:right w:val="single" w:sz="6" w:color="000000"/>
+            </w:tcBorders>
+          </w:tcPr>
+          <w:p>
+            <w:pPr>
+              <w:spacing w:before="60" w:after="60"/>
+              <w:jc w:val="center"/>
+            </w:pPr>
+            <w:r/>
+            <w:r>
+              <w:rPr>
+                <w:rFonts w:ascii="Times New Roman" w:hAnsi="Times New Roman" w:eastAsia="Times New Roman"/>
+                <w:b w:val="0"/>
+                <w:i w:val="0"/>
+                <w:sz w:val="26"/>
+              </w:rPr>
+              <w:t>9</w:t>
+            </w:r>
+          </w:p>
+        </w:tc>
+        <w:tc>
+          <w:tcPr>
+            <w:tcW w:type="dxa" w:w="2736"/>
+            <w:tcBorders>
+              <w:top w:val="single" w:sz="6" w:color="000000"/>
+              <w:left w:val="single" w:sz="6" w:color="000000"/>
+              <w:bottom w:val="single" w:sz="6" w:color="000000"/>
+              <w:right w:val="single" w:sz="6" w:color="000000"/>
+            </w:tcBorders>
+          </w:tcPr>
+          <w:p>
+            <w:pPr>
+              <w:spacing w:before="60" w:after="60"/>
+              <w:jc w:val="left"/>
+            </w:pPr>
+            <w:r/>
+            <w:r>
+              <w:rPr>
+                <w:rFonts w:ascii="Times New Roman" w:hAnsi="Times New Roman" w:eastAsia="Times New Roman"/>
+                <w:b w:val="0"/>
+                <w:i w:val="0"/>
+                <w:sz w:val="26"/>
+              </w:rPr>
+              <w:t>allocated_at</w:t>
             </w:r>
           </w:p>
         </w:tc>
@@ -19322,7 +20689,7 @@
           <w:i/>
           <w:sz w:val="26"/>
         </w:rPr>
-        <w:t>Table 18. Synthetic Demand Runs Table</w:t>
+        <w:t>Table 19. Synthetic Demand Runs Table</w:t>
       </w:r>
     </w:p>
     <w:tbl>
@@ -19502,7 +20869,7 @@
                 <w:i w:val="0"/>
                 <w:sz w:val="26"/>
               </w:rPr>
-              <w:t>run_id</w:t>
+              <w:t>id</w:t>
             </w:r>
           </w:p>
         </w:tc>
@@ -19529,7 +20896,7 @@
                 <w:i w:val="0"/>
                 <w:sz w:val="26"/>
               </w:rPr>
-              <w:t>bigint (PK)</w:t>
+              <w:t>uuid (PK)</w:t>
             </w:r>
           </w:p>
         </w:tc>
@@ -20344,7 +21711,7 @@
           <w:i w:val="0"/>
           <w:sz w:val="26"/>
         </w:rPr>
-        <w:t>Experiments Table: Results of running a policy on a demand dataset.</w:t>
+        <w:t>Experiment Groups Table: One multi-policy experiment request and its shared identity.</w:t>
       </w:r>
     </w:p>
     <w:p>
@@ -20359,7 +21726,7 @@
           <w:i/>
           <w:sz w:val="26"/>
         </w:rPr>
-        <w:t>Table 19. Experiments Table</w:t>
+        <w:t>Table 20. Experiment Groups Table</w:t>
       </w:r>
     </w:p>
     <w:tbl>
@@ -20539,7 +21906,7 @@
                 <w:i w:val="0"/>
                 <w:sz w:val="26"/>
               </w:rPr>
-              <w:t>experiment_id</w:t>
+              <w:t>id</w:t>
             </w:r>
           </w:p>
         </w:tc>
@@ -20566,7 +21933,7 @@
                 <w:i w:val="0"/>
                 <w:sz w:val="26"/>
               </w:rPr>
-              <w:t>bigint (PK)</w:t>
+              <w:t>uuid (PK)</w:t>
             </w:r>
           </w:p>
         </w:tc>
@@ -20593,7 +21960,7 @@
                 <w:i w:val="0"/>
                 <w:sz w:val="26"/>
               </w:rPr>
-              <w:t>Unique experiment identifier</w:t>
+              <w:t>API Experiment.id; stable identity of the multi-policy request</w:t>
             </w:r>
           </w:p>
         </w:tc>
@@ -20676,7 +22043,7 @@
                 <w:i w:val="0"/>
                 <w:sz w:val="26"/>
               </w:rPr>
-              <w:t>bigint (FK)</w:t>
+              <w:t>uuid (FK)</w:t>
             </w:r>
           </w:p>
         </w:tc>
@@ -20703,7 +22070,7 @@
                 <w:i w:val="0"/>
                 <w:sz w:val="26"/>
               </w:rPr>
-              <w:t>Foreign key referencing synthetic_demand_runs(run_id)</w:t>
+              <w:t>Foreign key referencing synthetic_demand_runs(id)</w:t>
             </w:r>
           </w:p>
         </w:tc>
@@ -20759,7 +22126,7 @@
                 <w:i w:val="0"/>
                 <w:sz w:val="26"/>
               </w:rPr>
-              <w:t>policy_id</w:t>
+              <w:t>seed</w:t>
             </w:r>
           </w:p>
         </w:tc>
@@ -20786,7 +22153,7 @@
                 <w:i w:val="0"/>
                 <w:sz w:val="26"/>
               </w:rPr>
-              <w:t>bigint (FK)</w:t>
+              <w:t>int</w:t>
             </w:r>
           </w:p>
         </w:tc>
@@ -20813,7 +22180,7 @@
                 <w:i w:val="0"/>
                 <w:sz w:val="26"/>
               </w:rPr>
-              <w:t>Foreign key referencing allocation_policies(policy_id)</w:t>
+              <w:t>Seed shared by all requested policy runs</w:t>
             </w:r>
           </w:p>
         </w:tc>
@@ -20869,7 +22236,7 @@
                 <w:i w:val="0"/>
                 <w:sz w:val="26"/>
               </w:rPr>
-              <w:t>seed</w:t>
+              <w:t>run_at</w:t>
             </w:r>
           </w:p>
         </w:tc>
@@ -20896,7 +22263,7 @@
                 <w:i w:val="0"/>
                 <w:sz w:val="26"/>
               </w:rPr>
-              <w:t>int</w:t>
+              <w:t>timestamptz</w:t>
             </w:r>
           </w:p>
         </w:tc>
@@ -20923,7 +22290,164 @@
                 <w:i w:val="0"/>
                 <w:sz w:val="26"/>
               </w:rPr>
-              <w:t>Seed used for the run</w:t>
+              <w:t>Run time</w:t>
+            </w:r>
+          </w:p>
+        </w:tc>
+      </w:tr>
+    </w:tbl>
+    <w:p>
+      <w:pPr>
+        <w:keepNext/>
+        <w:spacing w:before="280"/>
+      </w:pPr>
+      <w:r>
+        <w:rPr>
+          <w:rFonts w:ascii="Times New Roman" w:hAnsi="Times New Roman" w:eastAsia="Times New Roman"/>
+          <w:b w:val="0"/>
+          <w:i w:val="0"/>
+          <w:sz w:val="26"/>
+        </w:rPr>
+        <w:t>Experiments Table: One policy result within an experiment group.</w:t>
+      </w:r>
+    </w:p>
+    <w:p>
+      <w:pPr>
+        <w:keepNext/>
+        <w:jc w:val="center"/>
+      </w:pPr>
+      <w:r>
+        <w:rPr>
+          <w:rFonts w:ascii="Times New Roman" w:hAnsi="Times New Roman" w:eastAsia="Times New Roman"/>
+          <w:b w:val="0"/>
+          <w:i/>
+          <w:sz w:val="26"/>
+        </w:rPr>
+        <w:t>Table 21. Experiments Table</w:t>
+      </w:r>
+    </w:p>
+    <w:tbl>
+      <w:tblPr>
+        <w:tblW w:type="auto" w:w="0"/>
+        <w:jc w:val="center"/>
+        <w:tblLayout w:type="fixed"/>
+        <w:tblLook w:firstColumn="1" w:firstRow="1" w:lastColumn="0" w:lastRow="0" w:noHBand="0" w:noVBand="1" w:val="04A0"/>
+      </w:tblPr>
+      <w:tblGrid>
+        <w:gridCol w:w="2340"/>
+        <w:gridCol w:w="2340"/>
+        <w:gridCol w:w="2340"/>
+        <w:gridCol w:w="2340"/>
+      </w:tblGrid>
+      <w:tr>
+        <w:trPr>
+          <w:tblHeader w:val="true"/>
+        </w:trPr>
+        <w:tc>
+          <w:tcPr>
+            <w:tcW w:type="dxa" w:w="864"/>
+            <w:tcBorders>
+              <w:top w:val="single" w:sz="6" w:color="000000"/>
+              <w:left w:val="single" w:sz="6" w:color="000000"/>
+              <w:bottom w:val="single" w:sz="6" w:color="000000"/>
+              <w:right w:val="single" w:sz="6" w:color="000000"/>
+            </w:tcBorders>
+          </w:tcPr>
+          <w:p>
+            <w:pPr>
+              <w:spacing w:before="60" w:after="60"/>
+              <w:jc w:val="center"/>
+            </w:pPr>
+            <w:r/>
+            <w:r>
+              <w:rPr>
+                <w:rFonts w:ascii="Times New Roman" w:hAnsi="Times New Roman" w:eastAsia="Times New Roman"/>
+                <w:b/>
+                <w:i w:val="0"/>
+                <w:sz w:val="26"/>
+              </w:rPr>
+              <w:t>No.</w:t>
+            </w:r>
+          </w:p>
+        </w:tc>
+        <w:tc>
+          <w:tcPr>
+            <w:tcW w:type="dxa" w:w="2736"/>
+            <w:tcBorders>
+              <w:top w:val="single" w:sz="6" w:color="000000"/>
+              <w:left w:val="single" w:sz="6" w:color="000000"/>
+              <w:bottom w:val="single" w:sz="6" w:color="000000"/>
+              <w:right w:val="single" w:sz="6" w:color="000000"/>
+            </w:tcBorders>
+          </w:tcPr>
+          <w:p>
+            <w:pPr>
+              <w:spacing w:before="60" w:after="60"/>
+              <w:jc w:val="center"/>
+            </w:pPr>
+            <w:r/>
+            <w:r>
+              <w:rPr>
+                <w:rFonts w:ascii="Times New Roman" w:hAnsi="Times New Roman" w:eastAsia="Times New Roman"/>
+                <w:b/>
+                <w:i w:val="0"/>
+                <w:sz w:val="26"/>
+              </w:rPr>
+              <w:t>Field Name</w:t>
+            </w:r>
+          </w:p>
+        </w:tc>
+        <w:tc>
+          <w:tcPr>
+            <w:tcW w:type="dxa" w:w="2160"/>
+            <w:tcBorders>
+              <w:top w:val="single" w:sz="6" w:color="000000"/>
+              <w:left w:val="single" w:sz="6" w:color="000000"/>
+              <w:bottom w:val="single" w:sz="6" w:color="000000"/>
+              <w:right w:val="single" w:sz="6" w:color="000000"/>
+            </w:tcBorders>
+          </w:tcPr>
+          <w:p>
+            <w:pPr>
+              <w:spacing w:before="60" w:after="60"/>
+              <w:jc w:val="center"/>
+            </w:pPr>
+            <w:r/>
+            <w:r>
+              <w:rPr>
+                <w:rFonts w:ascii="Times New Roman" w:hAnsi="Times New Roman" w:eastAsia="Times New Roman"/>
+                <w:b/>
+                <w:i w:val="0"/>
+                <w:sz w:val="26"/>
+              </w:rPr>
+              <w:t>Type</w:t>
+            </w:r>
+          </w:p>
+        </w:tc>
+        <w:tc>
+          <w:tcPr>
+            <w:tcW w:type="dxa" w:w="4320"/>
+            <w:tcBorders>
+              <w:top w:val="single" w:sz="6" w:color="000000"/>
+              <w:left w:val="single" w:sz="6" w:color="000000"/>
+              <w:bottom w:val="single" w:sz="6" w:color="000000"/>
+              <w:right w:val="single" w:sz="6" w:color="000000"/>
+            </w:tcBorders>
+          </w:tcPr>
+          <w:p>
+            <w:pPr>
+              <w:spacing w:before="60" w:after="60"/>
+              <w:jc w:val="center"/>
+            </w:pPr>
+            <w:r/>
+            <w:r>
+              <w:rPr>
+                <w:rFonts w:ascii="Times New Roman" w:hAnsi="Times New Roman" w:eastAsia="Times New Roman"/>
+                <w:b/>
+                <w:i w:val="0"/>
+                <w:sz w:val="26"/>
+              </w:rPr>
+              <w:t>Description</w:t>
             </w:r>
           </w:p>
         </w:tc>
@@ -20952,7 +22476,7 @@
                 <w:i w:val="0"/>
                 <w:sz w:val="26"/>
               </w:rPr>
-              <w:t>5</w:t>
+              <w:t>1</w:t>
             </w:r>
           </w:p>
         </w:tc>
@@ -20979,7 +22503,7 @@
                 <w:i w:val="0"/>
                 <w:sz w:val="26"/>
               </w:rPr>
-              <w:t>gini_slots_per_student</w:t>
+              <w:t>id</w:t>
             </w:r>
           </w:p>
         </w:tc>
@@ -21006,7 +22530,7 @@
                 <w:i w:val="0"/>
                 <w:sz w:val="26"/>
               </w:rPr>
-              <w:t>numeric(6,4)</w:t>
+              <w:t>uuid (PK)</w:t>
             </w:r>
           </w:p>
         </w:tc>
@@ -21033,7 +22557,7 @@
                 <w:i w:val="0"/>
                 <w:sz w:val="26"/>
               </w:rPr>
-              <w:t>Gini index of slots per student</w:t>
+              <w:t>Unique policy-result identifier</w:t>
             </w:r>
           </w:p>
         </w:tc>
@@ -21062,7 +22586,7 @@
                 <w:i w:val="0"/>
                 <w:sz w:val="26"/>
               </w:rPr>
-              <w:t>6</w:t>
+              <w:t>2</w:t>
             </w:r>
           </w:p>
         </w:tc>
@@ -21089,7 +22613,7 @@
                 <w:i w:val="0"/>
                 <w:sz w:val="26"/>
               </w:rPr>
-              <w:t>gini_lecturer_access</w:t>
+              <w:t>experiment_group_id</w:t>
             </w:r>
           </w:p>
         </w:tc>
@@ -21116,7 +22640,7 @@
                 <w:i w:val="0"/>
                 <w:sz w:val="26"/>
               </w:rPr>
-              <w:t>numeric(6,4)</w:t>
+              <w:t>uuid (FK)</w:t>
             </w:r>
           </w:p>
         </w:tc>
@@ -21143,7 +22667,7 @@
                 <w:i w:val="0"/>
                 <w:sz w:val="26"/>
               </w:rPr>
-              <w:t>Gini index of access across lecturers</w:t>
+              <w:t>Foreign key referencing experiment_groups(id)</w:t>
             </w:r>
           </w:p>
         </w:tc>
@@ -21172,7 +22696,7 @@
                 <w:i w:val="0"/>
                 <w:sz w:val="26"/>
               </w:rPr>
-              <w:t>7</w:t>
+              <w:t>3</w:t>
             </w:r>
           </w:p>
         </w:tc>
@@ -21199,7 +22723,7 @@
                 <w:i w:val="0"/>
                 <w:sz w:val="26"/>
               </w:rPr>
-              <w:t>max_min_ratio</w:t>
+              <w:t>policy_id</w:t>
             </w:r>
           </w:p>
         </w:tc>
@@ -21226,7 +22750,7 @@
                 <w:i w:val="0"/>
                 <w:sz w:val="26"/>
               </w:rPr>
-              <w:t>numeric(10,4)</w:t>
+              <w:t>uuid (FK)</w:t>
             </w:r>
           </w:p>
         </w:tc>
@@ -21253,7 +22777,7 @@
                 <w:i w:val="0"/>
                 <w:sz w:val="26"/>
               </w:rPr>
-              <w:t>Ratio between best-served and worst-served student</w:t>
+              <w:t>Foreign key referencing allocation_policies(id)</w:t>
             </w:r>
           </w:p>
         </w:tc>
@@ -21282,7 +22806,7 @@
                 <w:i w:val="0"/>
                 <w:sz w:val="26"/>
               </w:rPr>
-              <w:t>8</w:t>
+              <w:t>4</w:t>
             </w:r>
           </w:p>
         </w:tc>
@@ -21309,7 +22833,7 @@
                 <w:i w:val="0"/>
                 <w:sz w:val="26"/>
               </w:rPr>
-              <w:t>pct_students_with_slot</w:t>
+              <w:t>policy_order</w:t>
             </w:r>
           </w:p>
         </w:tc>
@@ -21336,7 +22860,7 @@
                 <w:i w:val="0"/>
                 <w:sz w:val="26"/>
               </w:rPr>
-              <w:t>numeric(5,2)</w:t>
+              <w:t>smallint</w:t>
             </w:r>
           </w:p>
         </w:tc>
@@ -21363,7 +22887,7 @@
                 <w:i w:val="0"/>
                 <w:sz w:val="26"/>
               </w:rPr>
-              <w:t>Share of students who got a slot</w:t>
+              <w:t>Zero-based request order, 0 through 3</w:t>
             </w:r>
           </w:p>
         </w:tc>
@@ -21392,7 +22916,7 @@
                 <w:i w:val="0"/>
                 <w:sz w:val="26"/>
               </w:rPr>
-              <w:t>9</w:t>
+              <w:t>5</w:t>
             </w:r>
           </w:p>
         </w:tc>
@@ -21419,7 +22943,7 @@
                 <w:i w:val="0"/>
                 <w:sz w:val="26"/>
               </w:rPr>
-              <w:t>slot_utilization_pct</w:t>
+              <w:t>gini_slots_per_student</w:t>
             </w:r>
           </w:p>
         </w:tc>
@@ -21446,7 +22970,7 @@
                 <w:i w:val="0"/>
                 <w:sz w:val="26"/>
               </w:rPr>
-              <w:t>numeric(5,2)</w:t>
+              <w:t>numeric(6,4)</w:t>
             </w:r>
           </w:p>
         </w:tc>
@@ -21473,7 +22997,7 @@
                 <w:i w:val="0"/>
                 <w:sz w:val="26"/>
               </w:rPr>
-              <w:t>Share of slots that were filled</w:t>
+              <w:t>Gini index of slots per student</w:t>
             </w:r>
           </w:p>
         </w:tc>
@@ -21502,7 +23026,7 @@
                 <w:i w:val="0"/>
                 <w:sz w:val="26"/>
               </w:rPr>
-              <w:t>10</w:t>
+              <w:t>6</w:t>
             </w:r>
           </w:p>
         </w:tc>
@@ -21529,7 +23053,7 @@
                 <w:i w:val="0"/>
                 <w:sz w:val="26"/>
               </w:rPr>
-              <w:t>avg_time_to_fill_seconds</w:t>
+              <w:t>gini_lecturer_access</w:t>
             </w:r>
           </w:p>
         </w:tc>
@@ -21556,7 +23080,7 @@
                 <w:i w:val="0"/>
                 <w:sz w:val="26"/>
               </w:rPr>
-              <w:t>int</w:t>
+              <w:t>numeric(6,4)</w:t>
             </w:r>
           </w:p>
         </w:tc>
@@ -21583,7 +23107,7 @@
                 <w:i w:val="0"/>
                 <w:sz w:val="26"/>
               </w:rPr>
-              <w:t>Average time to fill a slot</w:t>
+              <w:t>Gini index of access across lecturers</w:t>
             </w:r>
           </w:p>
         </w:tc>
@@ -21612,7 +23136,7 @@
                 <w:i w:val="0"/>
                 <w:sz w:val="26"/>
               </w:rPr>
-              <w:t>11</w:t>
+              <w:t>7</w:t>
             </w:r>
           </w:p>
         </w:tc>
@@ -21639,7 +23163,7 @@
                 <w:i w:val="0"/>
                 <w:sz w:val="26"/>
               </w:rPr>
-              <w:t>offer_rejection_rate_pct</w:t>
+              <w:t>max_min_ratio</w:t>
             </w:r>
           </w:p>
         </w:tc>
@@ -21666,7 +23190,7 @@
                 <w:i w:val="0"/>
                 <w:sz w:val="26"/>
               </w:rPr>
-              <w:t>numeric(5,2)</w:t>
+              <w:t>numeric(10,4)</w:t>
             </w:r>
           </w:p>
         </w:tc>
@@ -21693,7 +23217,7 @@
                 <w:i w:val="0"/>
                 <w:sz w:val="26"/>
               </w:rPr>
-              <w:t>Share of offers rejected or expired</w:t>
+              <w:t>Ratio between best-served and worst-served student</w:t>
             </w:r>
           </w:p>
         </w:tc>
@@ -21722,7 +23246,7 @@
                 <w:i w:val="0"/>
                 <w:sz w:val="26"/>
               </w:rPr>
-              <w:t>12</w:t>
+              <w:t>8</w:t>
             </w:r>
           </w:p>
         </w:tc>
@@ -21749,7 +23273,7 @@
                 <w:i w:val="0"/>
                 <w:sz w:val="26"/>
               </w:rPr>
-              <w:t>avg_wait_time_seconds</w:t>
+              <w:t>pct_students_with_slot</w:t>
             </w:r>
           </w:p>
         </w:tc>
@@ -21776,7 +23300,7 @@
                 <w:i w:val="0"/>
                 <w:sz w:val="26"/>
               </w:rPr>
-              <w:t>int</w:t>
+              <w:t>numeric(5,2)</w:t>
             </w:r>
           </w:p>
         </w:tc>
@@ -21803,7 +23327,7 @@
                 <w:i w:val="0"/>
                 <w:sz w:val="26"/>
               </w:rPr>
-              <w:t>Average waiting time</w:t>
+              <w:t>Share of students who got a slot</w:t>
             </w:r>
           </w:p>
         </w:tc>
@@ -21832,7 +23356,7 @@
                 <w:i w:val="0"/>
                 <w:sz w:val="26"/>
               </w:rPr>
-              <w:t>13</w:t>
+              <w:t>9</w:t>
             </w:r>
           </w:p>
         </w:tc>
@@ -21859,7 +23383,7 @@
                 <w:i w:val="0"/>
                 <w:sz w:val="26"/>
               </w:rPr>
-              <w:t>wait_time_variance</w:t>
+              <w:t>slot_utilization_pct</w:t>
             </w:r>
           </w:p>
         </w:tc>
@@ -21886,7 +23410,7 @@
                 <w:i w:val="0"/>
                 <w:sz w:val="26"/>
               </w:rPr>
-              <w:t>numeric(14,4)</w:t>
+              <w:t>numeric(5,2)</w:t>
             </w:r>
           </w:p>
         </w:tc>
@@ -21913,7 +23437,7 @@
                 <w:i w:val="0"/>
                 <w:sz w:val="26"/>
               </w:rPr>
-              <w:t>Variance of waiting time</w:t>
+              <w:t>Share of slots that were filled</w:t>
             </w:r>
           </w:p>
         </w:tc>
@@ -21942,7 +23466,7 @@
                 <w:i w:val="0"/>
                 <w:sz w:val="26"/>
               </w:rPr>
-              <w:t>14</w:t>
+              <w:t>10</w:t>
             </w:r>
           </w:p>
         </w:tc>
@@ -21969,7 +23493,7 @@
                 <w:i w:val="0"/>
                 <w:sz w:val="26"/>
               </w:rPr>
-              <w:t>run_at</w:t>
+              <w:t>avg_time_to_fill_seconds</w:t>
             </w:r>
           </w:p>
         </w:tc>
@@ -21996,7 +23520,7 @@
                 <w:i w:val="0"/>
                 <w:sz w:val="26"/>
               </w:rPr>
-              <w:t>timestamptz</w:t>
+              <w:t>int</w:t>
             </w:r>
           </w:p>
         </w:tc>
@@ -22023,7 +23547,337 @@
                 <w:i w:val="0"/>
                 <w:sz w:val="26"/>
               </w:rPr>
-              <w:t>Run time</w:t>
+              <w:t>Average time to fill a slot</w:t>
+            </w:r>
+          </w:p>
+        </w:tc>
+      </w:tr>
+      <w:tr>
+        <w:tc>
+          <w:tcPr>
+            <w:tcW w:type="dxa" w:w="864"/>
+            <w:tcBorders>
+              <w:top w:val="single" w:sz="6" w:color="000000"/>
+              <w:left w:val="single" w:sz="6" w:color="000000"/>
+              <w:bottom w:val="single" w:sz="6" w:color="000000"/>
+              <w:right w:val="single" w:sz="6" w:color="000000"/>
+            </w:tcBorders>
+          </w:tcPr>
+          <w:p>
+            <w:pPr>
+              <w:spacing w:before="60" w:after="60"/>
+              <w:jc w:val="center"/>
+            </w:pPr>
+            <w:r/>
+            <w:r>
+              <w:rPr>
+                <w:rFonts w:ascii="Times New Roman" w:hAnsi="Times New Roman" w:eastAsia="Times New Roman"/>
+                <w:b w:val="0"/>
+                <w:i w:val="0"/>
+                <w:sz w:val="26"/>
+              </w:rPr>
+              <w:t>11</w:t>
+            </w:r>
+          </w:p>
+        </w:tc>
+        <w:tc>
+          <w:tcPr>
+            <w:tcW w:type="dxa" w:w="2736"/>
+            <w:tcBorders>
+              <w:top w:val="single" w:sz="6" w:color="000000"/>
+              <w:left w:val="single" w:sz="6" w:color="000000"/>
+              <w:bottom w:val="single" w:sz="6" w:color="000000"/>
+              <w:right w:val="single" w:sz="6" w:color="000000"/>
+            </w:tcBorders>
+          </w:tcPr>
+          <w:p>
+            <w:pPr>
+              <w:spacing w:before="60" w:after="60"/>
+              <w:jc w:val="left"/>
+            </w:pPr>
+            <w:r/>
+            <w:r>
+              <w:rPr>
+                <w:rFonts w:ascii="Times New Roman" w:hAnsi="Times New Roman" w:eastAsia="Times New Roman"/>
+                <w:b w:val="0"/>
+                <w:i w:val="0"/>
+                <w:sz w:val="26"/>
+              </w:rPr>
+              <w:t>offer_rejection_rate_pct</w:t>
+            </w:r>
+          </w:p>
+        </w:tc>
+        <w:tc>
+          <w:tcPr>
+            <w:tcW w:type="dxa" w:w="2160"/>
+            <w:tcBorders>
+              <w:top w:val="single" w:sz="6" w:color="000000"/>
+              <w:left w:val="single" w:sz="6" w:color="000000"/>
+              <w:bottom w:val="single" w:sz="6" w:color="000000"/>
+              <w:right w:val="single" w:sz="6" w:color="000000"/>
+            </w:tcBorders>
+          </w:tcPr>
+          <w:p>
+            <w:pPr>
+              <w:spacing w:before="60" w:after="60"/>
+              <w:jc w:val="left"/>
+            </w:pPr>
+            <w:r/>
+            <w:r>
+              <w:rPr>
+                <w:rFonts w:ascii="Times New Roman" w:hAnsi="Times New Roman" w:eastAsia="Times New Roman"/>
+                <w:b w:val="0"/>
+                <w:i w:val="0"/>
+                <w:sz w:val="26"/>
+              </w:rPr>
+              <w:t>numeric(5,2)</w:t>
+            </w:r>
+          </w:p>
+        </w:tc>
+        <w:tc>
+          <w:tcPr>
+            <w:tcW w:type="dxa" w:w="4320"/>
+            <w:tcBorders>
+              <w:top w:val="single" w:sz="6" w:color="000000"/>
+              <w:left w:val="single" w:sz="6" w:color="000000"/>
+              <w:bottom w:val="single" w:sz="6" w:color="000000"/>
+              <w:right w:val="single" w:sz="6" w:color="000000"/>
+            </w:tcBorders>
+          </w:tcPr>
+          <w:p>
+            <w:pPr>
+              <w:spacing w:before="60" w:after="60"/>
+              <w:jc w:val="left"/>
+            </w:pPr>
+            <w:r/>
+            <w:r>
+              <w:rPr>
+                <w:rFonts w:ascii="Times New Roman" w:hAnsi="Times New Roman" w:eastAsia="Times New Roman"/>
+                <w:b w:val="0"/>
+                <w:i w:val="0"/>
+                <w:sz w:val="26"/>
+              </w:rPr>
+              <w:t>Share of offers rejected or expired</w:t>
+            </w:r>
+          </w:p>
+        </w:tc>
+      </w:tr>
+      <w:tr>
+        <w:tc>
+          <w:tcPr>
+            <w:tcW w:type="dxa" w:w="864"/>
+            <w:tcBorders>
+              <w:top w:val="single" w:sz="6" w:color="000000"/>
+              <w:left w:val="single" w:sz="6" w:color="000000"/>
+              <w:bottom w:val="single" w:sz="6" w:color="000000"/>
+              <w:right w:val="single" w:sz="6" w:color="000000"/>
+            </w:tcBorders>
+          </w:tcPr>
+          <w:p>
+            <w:pPr>
+              <w:spacing w:before="60" w:after="60"/>
+              <w:jc w:val="center"/>
+            </w:pPr>
+            <w:r/>
+            <w:r>
+              <w:rPr>
+                <w:rFonts w:ascii="Times New Roman" w:hAnsi="Times New Roman" w:eastAsia="Times New Roman"/>
+                <w:b w:val="0"/>
+                <w:i w:val="0"/>
+                <w:sz w:val="26"/>
+              </w:rPr>
+              <w:t>12</w:t>
+            </w:r>
+          </w:p>
+        </w:tc>
+        <w:tc>
+          <w:tcPr>
+            <w:tcW w:type="dxa" w:w="2736"/>
+            <w:tcBorders>
+              <w:top w:val="single" w:sz="6" w:color="000000"/>
+              <w:left w:val="single" w:sz="6" w:color="000000"/>
+              <w:bottom w:val="single" w:sz="6" w:color="000000"/>
+              <w:right w:val="single" w:sz="6" w:color="000000"/>
+            </w:tcBorders>
+          </w:tcPr>
+          <w:p>
+            <w:pPr>
+              <w:spacing w:before="60" w:after="60"/>
+              <w:jc w:val="left"/>
+            </w:pPr>
+            <w:r/>
+            <w:r>
+              <w:rPr>
+                <w:rFonts w:ascii="Times New Roman" w:hAnsi="Times New Roman" w:eastAsia="Times New Roman"/>
+                <w:b w:val="0"/>
+                <w:i w:val="0"/>
+                <w:sz w:val="26"/>
+              </w:rPr>
+              <w:t>avg_wait_time_seconds</w:t>
+            </w:r>
+          </w:p>
+        </w:tc>
+        <w:tc>
+          <w:tcPr>
+            <w:tcW w:type="dxa" w:w="2160"/>
+            <w:tcBorders>
+              <w:top w:val="single" w:sz="6" w:color="000000"/>
+              <w:left w:val="single" w:sz="6" w:color="000000"/>
+              <w:bottom w:val="single" w:sz="6" w:color="000000"/>
+              <w:right w:val="single" w:sz="6" w:color="000000"/>
+            </w:tcBorders>
+          </w:tcPr>
+          <w:p>
+            <w:pPr>
+              <w:spacing w:before="60" w:after="60"/>
+              <w:jc w:val="left"/>
+            </w:pPr>
+            <w:r/>
+            <w:r>
+              <w:rPr>
+                <w:rFonts w:ascii="Times New Roman" w:hAnsi="Times New Roman" w:eastAsia="Times New Roman"/>
+                <w:b w:val="0"/>
+                <w:i w:val="0"/>
+                <w:sz w:val="26"/>
+              </w:rPr>
+              <w:t>int</w:t>
+            </w:r>
+          </w:p>
+        </w:tc>
+        <w:tc>
+          <w:tcPr>
+            <w:tcW w:type="dxa" w:w="4320"/>
+            <w:tcBorders>
+              <w:top w:val="single" w:sz="6" w:color="000000"/>
+              <w:left w:val="single" w:sz="6" w:color="000000"/>
+              <w:bottom w:val="single" w:sz="6" w:color="000000"/>
+              <w:right w:val="single" w:sz="6" w:color="000000"/>
+            </w:tcBorders>
+          </w:tcPr>
+          <w:p>
+            <w:pPr>
+              <w:spacing w:before="60" w:after="60"/>
+              <w:jc w:val="left"/>
+            </w:pPr>
+            <w:r/>
+            <w:r>
+              <w:rPr>
+                <w:rFonts w:ascii="Times New Roman" w:hAnsi="Times New Roman" w:eastAsia="Times New Roman"/>
+                <w:b w:val="0"/>
+                <w:i w:val="0"/>
+                <w:sz w:val="26"/>
+              </w:rPr>
+              <w:t>Average waiting time</w:t>
+            </w:r>
+          </w:p>
+        </w:tc>
+      </w:tr>
+      <w:tr>
+        <w:tc>
+          <w:tcPr>
+            <w:tcW w:type="dxa" w:w="864"/>
+            <w:tcBorders>
+              <w:top w:val="single" w:sz="6" w:color="000000"/>
+              <w:left w:val="single" w:sz="6" w:color="000000"/>
+              <w:bottom w:val="single" w:sz="6" w:color="000000"/>
+              <w:right w:val="single" w:sz="6" w:color="000000"/>
+            </w:tcBorders>
+          </w:tcPr>
+          <w:p>
+            <w:pPr>
+              <w:spacing w:before="60" w:after="60"/>
+              <w:jc w:val="center"/>
+            </w:pPr>
+            <w:r/>
+            <w:r>
+              <w:rPr>
+                <w:rFonts w:ascii="Times New Roman" w:hAnsi="Times New Roman" w:eastAsia="Times New Roman"/>
+                <w:b w:val="0"/>
+                <w:i w:val="0"/>
+                <w:sz w:val="26"/>
+              </w:rPr>
+              <w:t>13</w:t>
+            </w:r>
+          </w:p>
+        </w:tc>
+        <w:tc>
+          <w:tcPr>
+            <w:tcW w:type="dxa" w:w="2736"/>
+            <w:tcBorders>
+              <w:top w:val="single" w:sz="6" w:color="000000"/>
+              <w:left w:val="single" w:sz="6" w:color="000000"/>
+              <w:bottom w:val="single" w:sz="6" w:color="000000"/>
+              <w:right w:val="single" w:sz="6" w:color="000000"/>
+            </w:tcBorders>
+          </w:tcPr>
+          <w:p>
+            <w:pPr>
+              <w:spacing w:before="60" w:after="60"/>
+              <w:jc w:val="left"/>
+            </w:pPr>
+            <w:r/>
+            <w:r>
+              <w:rPr>
+                <w:rFonts w:ascii="Times New Roman" w:hAnsi="Times New Roman" w:eastAsia="Times New Roman"/>
+                <w:b w:val="0"/>
+                <w:i w:val="0"/>
+                <w:sz w:val="26"/>
+              </w:rPr>
+              <w:t>wait_time_variance</w:t>
+            </w:r>
+          </w:p>
+        </w:tc>
+        <w:tc>
+          <w:tcPr>
+            <w:tcW w:type="dxa" w:w="2160"/>
+            <w:tcBorders>
+              <w:top w:val="single" w:sz="6" w:color="000000"/>
+              <w:left w:val="single" w:sz="6" w:color="000000"/>
+              <w:bottom w:val="single" w:sz="6" w:color="000000"/>
+              <w:right w:val="single" w:sz="6" w:color="000000"/>
+            </w:tcBorders>
+          </w:tcPr>
+          <w:p>
+            <w:pPr>
+              <w:spacing w:before="60" w:after="60"/>
+              <w:jc w:val="left"/>
+            </w:pPr>
+            <w:r/>
+            <w:r>
+              <w:rPr>
+                <w:rFonts w:ascii="Times New Roman" w:hAnsi="Times New Roman" w:eastAsia="Times New Roman"/>
+                <w:b w:val="0"/>
+                <w:i w:val="0"/>
+                <w:sz w:val="26"/>
+              </w:rPr>
+              <w:t>numeric(14,4)</w:t>
+            </w:r>
+          </w:p>
+        </w:tc>
+        <w:tc>
+          <w:tcPr>
+            <w:tcW w:type="dxa" w:w="4320"/>
+            <w:tcBorders>
+              <w:top w:val="single" w:sz="6" w:color="000000"/>
+              <w:left w:val="single" w:sz="6" w:color="000000"/>
+              <w:bottom w:val="single" w:sz="6" w:color="000000"/>
+              <w:right w:val="single" w:sz="6" w:color="000000"/>
+            </w:tcBorders>
+          </w:tcPr>
+          <w:p>
+            <w:pPr>
+              <w:spacing w:before="60" w:after="60"/>
+              <w:jc w:val="left"/>
+            </w:pPr>
+            <w:r/>
+            <w:r>
+              <w:rPr>
+                <w:rFonts w:ascii="Times New Roman" w:hAnsi="Times New Roman" w:eastAsia="Times New Roman"/>
+                <w:b w:val="0"/>
+                <w:i w:val="0"/>
+                <w:sz w:val="26"/>
+              </w:rPr>
+              <w:t>Variance of waiting time</w:t>
             </w:r>
           </w:p>
         </w:tc>
@@ -22056,7 +23910,7 @@
           <w:i/>
           <w:sz w:val="26"/>
         </w:rPr>
-        <w:t>Table 20. Notifications Table</w:t>
+        <w:t>Table 22. Notifications Table</w:t>
       </w:r>
     </w:p>
     <w:tbl>
@@ -22236,7 +24090,7 @@
                 <w:i w:val="0"/>
                 <w:sz w:val="26"/>
               </w:rPr>
-              <w:t>notification_id</w:t>
+              <w:t>id</w:t>
             </w:r>
           </w:p>
         </w:tc>
@@ -22263,7 +24117,7 @@
                 <w:i w:val="0"/>
                 <w:sz w:val="26"/>
               </w:rPr>
-              <w:t>bigint (PK)</w:t>
+              <w:t>uuid (PK)</w:t>
             </w:r>
           </w:p>
         </w:tc>
@@ -22373,7 +24227,7 @@
                 <w:i w:val="0"/>
                 <w:sz w:val="26"/>
               </w:rPr>
-              <w:t>bigint (FK)</w:t>
+              <w:t>uuid (FK)</w:t>
             </w:r>
           </w:p>
         </w:tc>
@@ -22400,7 +24254,7 @@
                 <w:i w:val="0"/>
                 <w:sz w:val="26"/>
               </w:rPr>
-              <w:t>Foreign key referencing users(user_id)</w:t>
+              <w:t>Foreign key referencing users(id)</w:t>
             </w:r>
           </w:p>
         </w:tc>

</xml_diff>

<commit_message>
docs: add meeting_url, UUID ids and error format to API and schema docs
- meeting_url on availability_rules/exceptions, slots and bookings, plus
  PATCH /bookings/{id} to override the link per booking
- refresh_tokens table and the error code/error response format
- refresh the report guide now that auth is real; regenerate the docx
  and drawio schema exports

Co-Authored-By: Claude Sonnet 5.5 <noreply@anthropic.com>
</commit_message>
<xml_diff>
--- a/docs/DB-Schema-Tables.docx
+++ b/docs/DB-Schema-Tables.docx
@@ -5518,6 +5518,116 @@
                 <w:i w:val="0"/>
                 <w:sz w:val="26"/>
               </w:rPr>
+              <w:t>meeting_url</w:t>
+            </w:r>
+          </w:p>
+        </w:tc>
+        <w:tc>
+          <w:tcPr>
+            <w:tcW w:type="dxa" w:w="2160"/>
+            <w:tcBorders>
+              <w:top w:val="single" w:sz="6" w:color="000000"/>
+              <w:left w:val="single" w:sz="6" w:color="000000"/>
+              <w:bottom w:val="single" w:sz="6" w:color="000000"/>
+              <w:right w:val="single" w:sz="6" w:color="000000"/>
+            </w:tcBorders>
+          </w:tcPr>
+          <w:p>
+            <w:pPr>
+              <w:spacing w:before="60" w:after="60"/>
+              <w:jc w:val="left"/>
+            </w:pPr>
+            <w:r/>
+            <w:r>
+              <w:rPr>
+                <w:rFonts w:ascii="Times New Roman" w:hAnsi="Times New Roman" w:eastAsia="Times New Roman"/>
+                <w:b w:val="0"/>
+                <w:i w:val="0"/>
+                <w:sz w:val="26"/>
+              </w:rPr>
+              <w:t>varchar(500)</w:t>
+            </w:r>
+          </w:p>
+        </w:tc>
+        <w:tc>
+          <w:tcPr>
+            <w:tcW w:type="dxa" w:w="4320"/>
+            <w:tcBorders>
+              <w:top w:val="single" w:sz="6" w:color="000000"/>
+              <w:left w:val="single" w:sz="6" w:color="000000"/>
+              <w:bottom w:val="single" w:sz="6" w:color="000000"/>
+              <w:right w:val="single" w:sz="6" w:color="000000"/>
+            </w:tcBorders>
+          </w:tcPr>
+          <w:p>
+            <w:pPr>
+              <w:spacing w:before="60" w:after="60"/>
+              <w:jc w:val="left"/>
+            </w:pPr>
+            <w:r/>
+            <w:r>
+              <w:rPr>
+                <w:rFonts w:ascii="Times New Roman" w:hAnsi="Times New Roman" w:eastAsia="Times New Roman"/>
+                <w:b w:val="0"/>
+                <w:i w:val="0"/>
+                <w:sz w:val="26"/>
+              </w:rPr>
+              <w:t>Optional https meeting link copied to generated slots</w:t>
+            </w:r>
+          </w:p>
+        </w:tc>
+      </w:tr>
+      <w:tr>
+        <w:tc>
+          <w:tcPr>
+            <w:tcW w:type="dxa" w:w="864"/>
+            <w:tcBorders>
+              <w:top w:val="single" w:sz="6" w:color="000000"/>
+              <w:left w:val="single" w:sz="6" w:color="000000"/>
+              <w:bottom w:val="single" w:sz="6" w:color="000000"/>
+              <w:right w:val="single" w:sz="6" w:color="000000"/>
+            </w:tcBorders>
+          </w:tcPr>
+          <w:p>
+            <w:pPr>
+              <w:spacing w:before="60" w:after="60"/>
+              <w:jc w:val="center"/>
+            </w:pPr>
+            <w:r/>
+            <w:r>
+              <w:rPr>
+                <w:rFonts w:ascii="Times New Roman" w:hAnsi="Times New Roman" w:eastAsia="Times New Roman"/>
+                <w:b w:val="0"/>
+                <w:i w:val="0"/>
+                <w:sz w:val="26"/>
+              </w:rPr>
+              <w:t>11</w:t>
+            </w:r>
+          </w:p>
+        </w:tc>
+        <w:tc>
+          <w:tcPr>
+            <w:tcW w:type="dxa" w:w="2736"/>
+            <w:tcBorders>
+              <w:top w:val="single" w:sz="6" w:color="000000"/>
+              <w:left w:val="single" w:sz="6" w:color="000000"/>
+              <w:bottom w:val="single" w:sz="6" w:color="000000"/>
+              <w:right w:val="single" w:sz="6" w:color="000000"/>
+            </w:tcBorders>
+          </w:tcPr>
+          <w:p>
+            <w:pPr>
+              <w:spacing w:before="60" w:after="60"/>
+              <w:jc w:val="left"/>
+            </w:pPr>
+            <w:r/>
+            <w:r>
+              <w:rPr>
+                <w:rFonts w:ascii="Times New Roman" w:hAnsi="Times New Roman" w:eastAsia="Times New Roman"/>
+                <w:b w:val="0"/>
+                <w:i w:val="0"/>
+                <w:sz w:val="26"/>
+              </w:rPr>
               <w:t>created_at</w:t>
             </w:r>
           </w:p>
@@ -6555,6 +6665,116 @@
                 <w:i w:val="0"/>
                 <w:sz w:val="26"/>
               </w:rPr>
+              <w:t>meeting_url</w:t>
+            </w:r>
+          </w:p>
+        </w:tc>
+        <w:tc>
+          <w:tcPr>
+            <w:tcW w:type="dxa" w:w="2160"/>
+            <w:tcBorders>
+              <w:top w:val="single" w:sz="6" w:color="000000"/>
+              <w:left w:val="single" w:sz="6" w:color="000000"/>
+              <w:bottom w:val="single" w:sz="6" w:color="000000"/>
+              <w:right w:val="single" w:sz="6" w:color="000000"/>
+            </w:tcBorders>
+          </w:tcPr>
+          <w:p>
+            <w:pPr>
+              <w:spacing w:before="60" w:after="60"/>
+              <w:jc w:val="left"/>
+            </w:pPr>
+            <w:r/>
+            <w:r>
+              <w:rPr>
+                <w:rFonts w:ascii="Times New Roman" w:hAnsi="Times New Roman" w:eastAsia="Times New Roman"/>
+                <w:b w:val="0"/>
+                <w:i w:val="0"/>
+                <w:sz w:val="26"/>
+              </w:rPr>
+              <w:t>varchar(500)</w:t>
+            </w:r>
+          </w:p>
+        </w:tc>
+        <w:tc>
+          <w:tcPr>
+            <w:tcW w:type="dxa" w:w="4320"/>
+            <w:tcBorders>
+              <w:top w:val="single" w:sz="6" w:color="000000"/>
+              <w:left w:val="single" w:sz="6" w:color="000000"/>
+              <w:bottom w:val="single" w:sz="6" w:color="000000"/>
+              <w:right w:val="single" w:sz="6" w:color="000000"/>
+            </w:tcBorders>
+          </w:tcPr>
+          <w:p>
+            <w:pPr>
+              <w:spacing w:before="60" w:after="60"/>
+              <w:jc w:val="left"/>
+            </w:pPr>
+            <w:r/>
+            <w:r>
+              <w:rPr>
+                <w:rFonts w:ascii="Times New Roman" w:hAnsi="Times New Roman" w:eastAsia="Times New Roman"/>
+                <w:b w:val="0"/>
+                <w:i w:val="0"/>
+                <w:sz w:val="26"/>
+              </w:rPr>
+              <w:t>Optional https meeting link (ADD only)</w:t>
+            </w:r>
+          </w:p>
+        </w:tc>
+      </w:tr>
+      <w:tr>
+        <w:tc>
+          <w:tcPr>
+            <w:tcW w:type="dxa" w:w="864"/>
+            <w:tcBorders>
+              <w:top w:val="single" w:sz="6" w:color="000000"/>
+              <w:left w:val="single" w:sz="6" w:color="000000"/>
+              <w:bottom w:val="single" w:sz="6" w:color="000000"/>
+              <w:right w:val="single" w:sz="6" w:color="000000"/>
+            </w:tcBorders>
+          </w:tcPr>
+          <w:p>
+            <w:pPr>
+              <w:spacing w:before="60" w:after="60"/>
+              <w:jc w:val="center"/>
+            </w:pPr>
+            <w:r/>
+            <w:r>
+              <w:rPr>
+                <w:rFonts w:ascii="Times New Roman" w:hAnsi="Times New Roman" w:eastAsia="Times New Roman"/>
+                <w:b w:val="0"/>
+                <w:i w:val="0"/>
+                <w:sz w:val="26"/>
+              </w:rPr>
+              <w:t>9</w:t>
+            </w:r>
+          </w:p>
+        </w:tc>
+        <w:tc>
+          <w:tcPr>
+            <w:tcW w:type="dxa" w:w="2736"/>
+            <w:tcBorders>
+              <w:top w:val="single" w:sz="6" w:color="000000"/>
+              <w:left w:val="single" w:sz="6" w:color="000000"/>
+              <w:bottom w:val="single" w:sz="6" w:color="000000"/>
+              <w:right w:val="single" w:sz="6" w:color="000000"/>
+            </w:tcBorders>
+          </w:tcPr>
+          <w:p>
+            <w:pPr>
+              <w:spacing w:before="60" w:after="60"/>
+              <w:jc w:val="left"/>
+            </w:pPr>
+            <w:r/>
+            <w:r>
+              <w:rPr>
+                <w:rFonts w:ascii="Times New Roman" w:hAnsi="Times New Roman" w:eastAsia="Times New Roman"/>
+                <w:b w:val="0"/>
+                <w:i w:val="0"/>
+                <w:sz w:val="26"/>
+              </w:rPr>
               <w:t>created_at</w:t>
             </w:r>
           </w:p>
@@ -7541,6 +7761,116 @@
           </w:p>
         </w:tc>
       </w:tr>
+      <w:tr>
+        <w:tc>
+          <w:tcPr>
+            <w:tcW w:type="dxa" w:w="864"/>
+            <w:tcBorders>
+              <w:top w:val="single" w:sz="6" w:color="000000"/>
+              <w:left w:val="single" w:sz="6" w:color="000000"/>
+              <w:bottom w:val="single" w:sz="6" w:color="000000"/>
+              <w:right w:val="single" w:sz="6" w:color="000000"/>
+            </w:tcBorders>
+          </w:tcPr>
+          <w:p>
+            <w:pPr>
+              <w:spacing w:before="60" w:after="60"/>
+              <w:jc w:val="center"/>
+            </w:pPr>
+            <w:r/>
+            <w:r>
+              <w:rPr>
+                <w:rFonts w:ascii="Times New Roman" w:hAnsi="Times New Roman" w:eastAsia="Times New Roman"/>
+                <w:b w:val="0"/>
+                <w:i w:val="0"/>
+                <w:sz w:val="26"/>
+              </w:rPr>
+              <w:t>8</w:t>
+            </w:r>
+          </w:p>
+        </w:tc>
+        <w:tc>
+          <w:tcPr>
+            <w:tcW w:type="dxa" w:w="2736"/>
+            <w:tcBorders>
+              <w:top w:val="single" w:sz="6" w:color="000000"/>
+              <w:left w:val="single" w:sz="6" w:color="000000"/>
+              <w:bottom w:val="single" w:sz="6" w:color="000000"/>
+              <w:right w:val="single" w:sz="6" w:color="000000"/>
+            </w:tcBorders>
+          </w:tcPr>
+          <w:p>
+            <w:pPr>
+              <w:spacing w:before="60" w:after="60"/>
+              <w:jc w:val="left"/>
+            </w:pPr>
+            <w:r/>
+            <w:r>
+              <w:rPr>
+                <w:rFonts w:ascii="Times New Roman" w:hAnsi="Times New Roman" w:eastAsia="Times New Roman"/>
+                <w:b w:val="0"/>
+                <w:i w:val="0"/>
+                <w:sz w:val="26"/>
+              </w:rPr>
+              <w:t>meeting_url</w:t>
+            </w:r>
+          </w:p>
+        </w:tc>
+        <w:tc>
+          <w:tcPr>
+            <w:tcW w:type="dxa" w:w="2160"/>
+            <w:tcBorders>
+              <w:top w:val="single" w:sz="6" w:color="000000"/>
+              <w:left w:val="single" w:sz="6" w:color="000000"/>
+              <w:bottom w:val="single" w:sz="6" w:color="000000"/>
+              <w:right w:val="single" w:sz="6" w:color="000000"/>
+            </w:tcBorders>
+          </w:tcPr>
+          <w:p>
+            <w:pPr>
+              <w:spacing w:before="60" w:after="60"/>
+              <w:jc w:val="left"/>
+            </w:pPr>
+            <w:r/>
+            <w:r>
+              <w:rPr>
+                <w:rFonts w:ascii="Times New Roman" w:hAnsi="Times New Roman" w:eastAsia="Times New Roman"/>
+                <w:b w:val="0"/>
+                <w:i w:val="0"/>
+                <w:sz w:val="26"/>
+              </w:rPr>
+              <w:t>varchar(500)</w:t>
+            </w:r>
+          </w:p>
+        </w:tc>
+        <w:tc>
+          <w:tcPr>
+            <w:tcW w:type="dxa" w:w="4320"/>
+            <w:tcBorders>
+              <w:top w:val="single" w:sz="6" w:color="000000"/>
+              <w:left w:val="single" w:sz="6" w:color="000000"/>
+              <w:bottom w:val="single" w:sz="6" w:color="000000"/>
+              <w:right w:val="single" w:sz="6" w:color="000000"/>
+            </w:tcBorders>
+          </w:tcPr>
+          <w:p>
+            <w:pPr>
+              <w:spacing w:before="60" w:after="60"/>
+              <w:jc w:val="left"/>
+            </w:pPr>
+            <w:r/>
+            <w:r>
+              <w:rPr>
+                <w:rFonts w:ascii="Times New Roman" w:hAnsi="Times New Roman" w:eastAsia="Times New Roman"/>
+                <w:b w:val="0"/>
+                <w:i w:val="0"/>
+                <w:sz w:val="26"/>
+              </w:rPr>
+              <w:t>Online meeting link copied from the rule; NULL means in person</w:t>
+            </w:r>
+          </w:p>
+        </w:tc>
+      </w:tr>
     </w:tbl>
     <w:p>
       <w:pPr>
@@ -15150,7 +15480,7 @@
                 <w:i w:val="0"/>
                 <w:sz w:val="26"/>
               </w:rPr>
-              <w:t>created_at</w:t>
+              <w:t>meeting_url</w:t>
             </w:r>
           </w:p>
         </w:tc>
@@ -15177,7 +15507,7 @@
                 <w:i w:val="0"/>
                 <w:sz w:val="26"/>
               </w:rPr>
-              <w:t>timestamptz</w:t>
+              <w:t>varchar(500)</w:t>
             </w:r>
           </w:p>
         </w:tc>
@@ -15204,7 +15534,7 @@
                 <w:i w:val="0"/>
                 <w:sz w:val="26"/>
               </w:rPr>
-              <w:t>Request time</w:t>
+              <w:t>Per-booking override of the slot's meeting link</w:t>
             </w:r>
           </w:p>
         </w:tc>
@@ -15260,7 +15590,7 @@
                 <w:i w:val="0"/>
                 <w:sz w:val="26"/>
               </w:rPr>
-              <w:t>confirmed_at</w:t>
+              <w:t>created_at</w:t>
             </w:r>
           </w:p>
         </w:tc>
@@ -15314,7 +15644,7 @@
                 <w:i w:val="0"/>
                 <w:sz w:val="26"/>
               </w:rPr>
-              <w:t>Confirmation time</w:t>
+              <w:t>Request time</w:t>
             </w:r>
           </w:p>
         </w:tc>
@@ -15370,7 +15700,7 @@
                 <w:i w:val="0"/>
                 <w:sz w:val="26"/>
               </w:rPr>
-              <w:t>cancelled_at</w:t>
+              <w:t>confirmed_at</w:t>
             </w:r>
           </w:p>
         </w:tc>
@@ -15424,7 +15754,7 @@
                 <w:i w:val="0"/>
                 <w:sz w:val="26"/>
               </w:rPr>
-              <w:t>Cancellation time</w:t>
+              <w:t>Confirmation time</w:t>
             </w:r>
           </w:p>
         </w:tc>
@@ -15454,6 +15784,116 @@
                 <w:sz w:val="26"/>
               </w:rPr>
               <w:t>15</w:t>
+            </w:r>
+          </w:p>
+        </w:tc>
+        <w:tc>
+          <w:tcPr>
+            <w:tcW w:type="dxa" w:w="2736"/>
+            <w:tcBorders>
+              <w:top w:val="single" w:sz="6" w:color="000000"/>
+              <w:left w:val="single" w:sz="6" w:color="000000"/>
+              <w:bottom w:val="single" w:sz="6" w:color="000000"/>
+              <w:right w:val="single" w:sz="6" w:color="000000"/>
+            </w:tcBorders>
+          </w:tcPr>
+          <w:p>
+            <w:pPr>
+              <w:spacing w:before="60" w:after="60"/>
+              <w:jc w:val="left"/>
+            </w:pPr>
+            <w:r/>
+            <w:r>
+              <w:rPr>
+                <w:rFonts w:ascii="Times New Roman" w:hAnsi="Times New Roman" w:eastAsia="Times New Roman"/>
+                <w:b w:val="0"/>
+                <w:i w:val="0"/>
+                <w:sz w:val="26"/>
+              </w:rPr>
+              <w:t>cancelled_at</w:t>
+            </w:r>
+          </w:p>
+        </w:tc>
+        <w:tc>
+          <w:tcPr>
+            <w:tcW w:type="dxa" w:w="2160"/>
+            <w:tcBorders>
+              <w:top w:val="single" w:sz="6" w:color="000000"/>
+              <w:left w:val="single" w:sz="6" w:color="000000"/>
+              <w:bottom w:val="single" w:sz="6" w:color="000000"/>
+              <w:right w:val="single" w:sz="6" w:color="000000"/>
+            </w:tcBorders>
+          </w:tcPr>
+          <w:p>
+            <w:pPr>
+              <w:spacing w:before="60" w:after="60"/>
+              <w:jc w:val="left"/>
+            </w:pPr>
+            <w:r/>
+            <w:r>
+              <w:rPr>
+                <w:rFonts w:ascii="Times New Roman" w:hAnsi="Times New Roman" w:eastAsia="Times New Roman"/>
+                <w:b w:val="0"/>
+                <w:i w:val="0"/>
+                <w:sz w:val="26"/>
+              </w:rPr>
+              <w:t>timestamptz</w:t>
+            </w:r>
+          </w:p>
+        </w:tc>
+        <w:tc>
+          <w:tcPr>
+            <w:tcW w:type="dxa" w:w="4320"/>
+            <w:tcBorders>
+              <w:top w:val="single" w:sz="6" w:color="000000"/>
+              <w:left w:val="single" w:sz="6" w:color="000000"/>
+              <w:bottom w:val="single" w:sz="6" w:color="000000"/>
+              <w:right w:val="single" w:sz="6" w:color="000000"/>
+            </w:tcBorders>
+          </w:tcPr>
+          <w:p>
+            <w:pPr>
+              <w:spacing w:before="60" w:after="60"/>
+              <w:jc w:val="left"/>
+            </w:pPr>
+            <w:r/>
+            <w:r>
+              <w:rPr>
+                <w:rFonts w:ascii="Times New Roman" w:hAnsi="Times New Roman" w:eastAsia="Times New Roman"/>
+                <w:b w:val="0"/>
+                <w:i w:val="0"/>
+                <w:sz w:val="26"/>
+              </w:rPr>
+              <w:t>Cancellation time</w:t>
+            </w:r>
+          </w:p>
+        </w:tc>
+      </w:tr>
+      <w:tr>
+        <w:tc>
+          <w:tcPr>
+            <w:tcW w:type="dxa" w:w="864"/>
+            <w:tcBorders>
+              <w:top w:val="single" w:sz="6" w:color="000000"/>
+              <w:left w:val="single" w:sz="6" w:color="000000"/>
+              <w:bottom w:val="single" w:sz="6" w:color="000000"/>
+              <w:right w:val="single" w:sz="6" w:color="000000"/>
+            </w:tcBorders>
+          </w:tcPr>
+          <w:p>
+            <w:pPr>
+              <w:spacing w:before="60" w:after="60"/>
+              <w:jc w:val="center"/>
+            </w:pPr>
+            <w:r/>
+            <w:r>
+              <w:rPr>
+                <w:rFonts w:ascii="Times New Roman" w:hAnsi="Times New Roman" w:eastAsia="Times New Roman"/>
+                <w:b w:val="0"/>
+                <w:i w:val="0"/>
+                <w:sz w:val="26"/>
+              </w:rPr>
+              <w:t>16</w:t>
             </w:r>
           </w:p>
         </w:tc>

</xml_diff>